<commit_message>
Refactor SMS services, add admin API, deployment settings, Wiza SMS account hook, and update layout/auth/nav components
</commit_message>
<xml_diff>
--- a/Trinity_Family_School_Production_Safety_Remediation_Runbook_2026-07-15.docx
+++ b/Trinity_Family_School_Production_Safety_Remediation_Runbook_2026-07-15.docx
@@ -34,7 +34,7 @@
         <w:jc w:val="center"/>
       </w:pPr>
       <w:r>
-        <w:t>A staged, non-breaking plan for resolving the verified codebase risks and preparing the application for production</w:t>
+        <w:t>A live-production, non-breaking plan that preserves speed, offline resilience and low Firestore read/write usage while closing verified security and reliability risks</w:t>
       </w:r>
     </w:p>
     <w:p>
@@ -43,11 +43,7 @@
         <w:jc w:val="center"/>
       </w:pPr>
       <w:r>
-        <w:rPr>
-          <w:b/>
-          <w:color w:val="1F4D78"/>
-        </w:rPr>
-        <w:t>Current verified snapshot: 15 July 2026</w:t>
+        <w:t>Initial verified snapshot: 15 July 2026  |  Live-production revision: 18 July 2026</w:t>
       </w:r>
     </w:p>
     <w:tbl>
@@ -158,14 +154,15 @@
           </w:tcPr>
           <w:p>
             <w:pPr>
-              <w:spacing w:after="40" w:before="0" w:line="252" w:lineRule="auto"/>
-            </w:pPr>
-            <w:r>
-              <w:rPr>
-                <w:rFonts w:ascii="Calibri" w:hAnsi="Calibri"/>
+              <w:spacing w:before="0" w:after="40" w:line="252" w:lineRule="auto"/>
+            </w:pPr>
+            <w:r>
+              <w:rPr>
+                <w:rFonts w:ascii="Calibri" w:hAnsi="Calibri"/>
+                <w:b w:val="0"/>
                 <w:sz w:val="19"/>
               </w:rPr>
-              <w:t>Convert audit findings into an exact remediation flow with safeguards, rollback points, and release gates</w:t>
+              <w:t>Convert audit findings into an exact live-production remediation flow with performance protections, safeguards, rollback points, and release gates</w:t>
             </w:r>
           </w:p>
         </w:tc>
@@ -210,14 +207,15 @@
           </w:tcPr>
           <w:p>
             <w:pPr>
-              <w:spacing w:after="40" w:before="0" w:line="252" w:lineRule="auto"/>
-            </w:pPr>
-            <w:r>
-              <w:rPr>
-                <w:rFonts w:ascii="Calibri" w:hAnsi="Calibri"/>
+              <w:spacing w:before="0" w:after="40" w:line="252" w:lineRule="auto"/>
+            </w:pPr>
+            <w:r>
+              <w:rPr>
+                <w:rFonts w:ascii="Calibri" w:hAnsi="Calibri"/>
+                <w:b w:val="0"/>
                 <w:sz w:val="19"/>
               </w:rPr>
-              <w:t>Action plan — implementation has not yet been performed by this document</w:t>
+              <w:t>Active production system - revised action plan; changes must use canaries, compatibility paths, monitoring and rollback</w:t>
             </w:r>
           </w:p>
         </w:tc>
@@ -262,14 +260,15 @@
           </w:tcPr>
           <w:p>
             <w:pPr>
-              <w:spacing w:after="40" w:before="0" w:line="252" w:lineRule="auto"/>
-            </w:pPr>
-            <w:r>
-              <w:rPr>
-                <w:rFonts w:ascii="Calibri" w:hAnsi="Calibri"/>
+              <w:spacing w:before="0" w:after="40" w:line="252" w:lineRule="auto"/>
+            </w:pPr>
+            <w:r>
+              <w:rPr>
+                <w:rFonts w:ascii="Calibri" w:hAnsi="Calibri"/>
+                <w:b w:val="0"/>
                 <w:sz w:val="19"/>
               </w:rPr>
-              <w:t>Expand → migrate → verify → contract</w:t>
+              <w:t>Measure -&gt; expand -&gt; migrate -&gt; verify security and performance -&gt; contract</w:t>
             </w:r>
           </w:p>
         </w:tc>
@@ -302,7 +301,7 @@
     </w:p>
     <w:p>
       <w:r>
-        <w:t>This runbook translates the whole-repository review into an implementation sequence. It explains what is wrong, how the issue can be exploited or cause operational damage, the safest countermeasure, the exact order of work, how active components remain compatible during migration, and the evidence required before progressing. File and line references identify the verified snapshot; re-check them if the code moves.</w:t>
+        <w:t>This runbook translates the whole-repository review into an implementation sequence for an application that is already serving real users in production. It explains what is wrong, how the issue can cause operational or security damage, the safest countermeasure, the exact order of work, how current components remain compatible, how speed and database-read efficiency are protected, and the evidence required before progressing. File and line references identify the verified snapshot; re-check them if the code moves.</w:t>
       </w:r>
     </w:p>
     <w:tbl>
@@ -324,7 +323,7 @@
         <w:tc>
           <w:tcPr>
             <w:tcW w:type="dxa" w:w="9360"/>
-            <w:shd w:fill="FCE8E6"/>
+            <w:shd w:fill="FFF5D6"/>
             <w:tcMar>
               <w:top w:w="80" w:type="dxa"/>
               <w:start w:w="120" w:type="dxa"/>
@@ -352,11 +351,7 @@
               <w:spacing w:after="40" w:line="252" w:lineRule="auto" w:before="0"/>
             </w:pPr>
             <w:r>
-              <w:rPr>
-                <w:rFonts w:ascii="Calibri" w:hAnsi="Calibri"/>
-                <w:sz w:val="19"/>
-              </w:rPr>
-              <w:t>The application should not be treated as production-safe in the reviewed state. The immediate blockers are public Firestore access, forgeable browser-side authentication, unauthenticated mutating APIs and Cloud Functions, exposed or fallback provider credentials, optional payment-webhook verification, and fail-open cron authentication.</w:t>
+              <w:t>The application is already operating at production level. The reviewed risks therefore require controlled live remediation, not a pre-production stop/go decision. Keep service available while immediately containing the highest-risk paths, measuring every change, and rolling out security controls through canaries and reversible compatibility layers.</w:t>
             </w:r>
           </w:p>
         </w:tc>
@@ -366,6 +361,74 @@
       <w:pPr>
         <w:spacing w:after="0"/>
       </w:pPr>
+    </w:p>
+    <w:p>
+      <w:pPr>
+        <w:pStyle w:val="Heading2"/>
+      </w:pPr>
+      <w:r>
+        <w:t>Owner clarifications adopted in this revision</w:t>
+      </w:r>
+    </w:p>
+    <w:p>
+      <w:pPr>
+        <w:spacing w:after="100"/>
+      </w:pPr>
+      <w:r>
+        <w:rPr>
+          <w:b/>
+          <w:color w:val="1F4D78"/>
+        </w:rPr>
+        <w:t xml:space="preserve">Live system: </w:t>
+      </w:r>
+      <w:r>
+        <w:t>The application is already used in production. All remediation must assume active users, real data, provider costs, and limited maintenance windows.</w:t>
+      </w:r>
+    </w:p>
+    <w:p>
+      <w:pPr>
+        <w:spacing w:after="100"/>
+      </w:pPr>
+      <w:r>
+        <w:rPr>
+          <w:b/>
+          <w:color w:val="1F4D78"/>
+        </w:rPr>
+        <w:t xml:space="preserve">Caching objective: </w:t>
+      </w:r>
+      <w:r>
+        <w:t>Cached and preloaded data was intentionally introduced to keep screens fast during slow network/database responses and to reduce Firestore reads and writes. The plan preserves this benefit and changes only unsafe scope, invalidation, identity trust, and sensitive-data handling.</w:t>
+      </w:r>
+    </w:p>
+    <w:p>
+      <w:pPr>
+        <w:spacing w:after="100"/>
+      </w:pPr>
+      <w:r>
+        <w:rPr>
+          <w:b/>
+          <w:color w:val="1F4D78"/>
+        </w:rPr>
+        <w:t xml:space="preserve">Login objective: </w:t>
+      </w:r>
+      <w:r>
+        <w:t>Fast sign-in and instant returning-user restoration remain required. The revised design uses secure Firebase session restoration, indexed lookups and cached display state so security does not add a visible delay.</w:t>
+      </w:r>
+    </w:p>
+    <w:p>
+      <w:pPr>
+        <w:spacing w:after="100"/>
+      </w:pPr>
+      <w:r>
+        <w:rPr>
+          <w:b/>
+          <w:color w:val="1F4D78"/>
+        </w:rPr>
+        <w:t xml:space="preserve">Credential-management objective: </w:t>
+      </w:r>
+      <w:r>
+        <w:t>An authorized administrator must be able to enter or rotate provider credentials inside the application instead of editing Vercel environment variables. The UI may collect the value, but private credentials must cross directly to a protected server function and be stored in a server-only secret store; they must never be bundled into or returned to frontend JavaScript.</w:t>
+      </w:r>
     </w:p>
     <w:p>
       <w:pPr>
@@ -408,7 +471,7 @@
         <w:spacing w:after="80"/>
       </w:pPr>
       <w:r>
-        <w:t>Deploy each behavioral change to a separate Firebase/Vercel staging environment first. Run the listed workflow tests and capture evidence.</w:t>
+        <w:t>Test each behavioral change in an isolated Firebase/Vercel staging environment, then use an internal-user canary or small production cohort. Expand only when error rate, login speed, route speed and Firestore read/write counts remain within the approved thresholds.</w:t>
       </w:r>
     </w:p>
     <w:p>
@@ -915,6 +978,42 @@
     </w:p>
     <w:p>
       <w:pPr>
+        <w:spacing w:after="80"/>
+        <w:numPr>
+          <w:ilvl w:val="0"/>
+          <w:numId w:val="11"/>
+        </w:numPr>
+      </w:pPr>
+      <w:r>
+        <w:t>Do not remove persistent cache, preloading or warm-session restoration as a blanket security response. First partition it by user and school, classify data sensitivity, add freshness/version rules, and prove that the replacement is at least as fast and no more expensive in Firestore reads/writes.</w:t>
+      </w:r>
+    </w:p>
+    <w:p>
+      <w:pPr>
+        <w:spacing w:after="80"/>
+        <w:numPr>
+          <w:ilvl w:val="0"/>
+          <w:numId w:val="11"/>
+        </w:numPr>
+      </w:pPr>
+      <w:r>
+        <w:t>Do not make every page load or API request fetch a full user/permission document. Use verified Firebase sessions and compact server-issued claims for common authorization, then refresh claims only when permissions change.</w:t>
+      </w:r>
+    </w:p>
+    <w:p>
+      <w:pPr>
+        <w:spacing w:after="80"/>
+        <w:numPr>
+          <w:ilvl w:val="0"/>
+          <w:numId w:val="11"/>
+        </w:numPr>
+      </w:pPr>
+      <w:r>
+        <w:t>Do not place a private SMS, payment, webhook or administrative provider secret in NEXT_PUBLIC variables, Firestore-readable documents, browser storage, frontend source or API responses. In-app entry is supported through a protected secret-broker function; frontend storage is not.</w:t>
+      </w:r>
+    </w:p>
+    <w:p>
+      <w:pPr>
         <w:pStyle w:val="Heading1"/>
       </w:pPr>
       <w:r>
@@ -1133,14 +1232,15 @@
           </w:tcPr>
           <w:p>
             <w:pPr>
-              <w:spacing w:after="40" w:before="0" w:line="252" w:lineRule="auto"/>
-            </w:pPr>
-            <w:r>
-              <w:rPr>
-                <w:rFonts w:ascii="Calibri" w:hAnsi="Calibri"/>
+              <w:spacing w:before="0" w:after="40" w:line="252" w:lineRule="auto"/>
+            </w:pPr>
+            <w:r>
+              <w:rPr>
+                <w:rFonts w:ascii="Calibri" w:hAnsi="Calibri"/>
+                <w:b w:val="0"/>
                 <w:sz w:val="16"/>
               </w:rPr>
-              <w:t>Custom browser login, reversible Base64 password representation, and indefinite localStorage restore.</w:t>
+              <w:t>Fast login uses custom browser authentication, reversible Base64 password representation, and indefinite localStorage user restoration.</w:t>
             </w:r>
           </w:p>
         </w:tc>
@@ -1157,14 +1257,15 @@
           </w:tcPr>
           <w:p>
             <w:pPr>
-              <w:spacing w:after="40" w:before="0" w:line="252" w:lineRule="auto"/>
-            </w:pPr>
-            <w:r>
-              <w:rPr>
-                <w:rFonts w:ascii="Calibri" w:hAnsi="Calibri"/>
+              <w:spacing w:before="0" w:after="40" w:line="252" w:lineRule="auto"/>
+            </w:pPr>
+            <w:r>
+              <w:rPr>
+                <w:rFonts w:ascii="Calibri" w:hAnsi="Calibri"/>
+                <w:b w:val="0"/>
                 <w:sz w:val="16"/>
               </w:rPr>
-              <w:t>A local browser value can impersonate a user; passwords lack modern protection.</w:t>
+              <w:t>The speed goal is valid, but cached user state is currently mixed with proof of identity; preserve instant restoration while moving trust to verified sessions.</w:t>
             </w:r>
           </w:p>
         </w:tc>
@@ -1651,14 +1752,15 @@
           </w:tcPr>
           <w:p>
             <w:pPr>
-              <w:spacing w:after="40" w:before="0" w:line="252" w:lineRule="auto"/>
-            </w:pPr>
-            <w:r>
-              <w:rPr>
-                <w:rFonts w:ascii="Calibri" w:hAnsi="Calibri"/>
+              <w:spacing w:before="0" w:after="40" w:line="252" w:lineRule="auto"/>
+            </w:pPr>
+            <w:r>
+              <w:rPr>
+                <w:rFonts w:ascii="Calibri" w:hAnsi="Calibri"/>
+                <w:b w:val="0"/>
                 <w:sz w:val="16"/>
               </w:rPr>
-              <w:t>Large global preloads plus persistent Firestore browser cache.</w:t>
+              <w:t>Broad preloads and persistent Firestore cache intentionally improve responsiveness and reduce reads during slow data access.</w:t>
             </w:r>
           </w:p>
         </w:tc>
@@ -1675,14 +1777,15 @@
           </w:tcPr>
           <w:p>
             <w:pPr>
-              <w:spacing w:after="40" w:before="0" w:line="252" w:lineRule="auto"/>
-            </w:pPr>
-            <w:r>
-              <w:rPr>
-                <w:rFonts w:ascii="Calibri" w:hAnsi="Calibri"/>
+              <w:spacing w:before="0" w:after="40" w:line="252" w:lineRule="auto"/>
+            </w:pPr>
+            <w:r>
+              <w:rPr>
+                <w:rFonts w:ascii="Calibri" w:hAnsi="Calibri"/>
+                <w:b w:val="0"/>
                 <w:sz w:val="16"/>
               </w:rPr>
-              <w:t>Excess data exposure, slow startup, and sensitive data retention after logout.</w:t>
+              <w:t>Keep the cache, but partition it by authenticated user/school, limit sensitive scope, version/invalidate it, and clear protected records on logout/account switch.</w:t>
             </w:r>
           </w:p>
         </w:tc>
@@ -2620,7 +2723,7 @@
         <w:spacing w:after="80"/>
       </w:pPr>
       <w:r>
-        <w:t>User submits credentials to a server-only login endpoint over HTTPS.</w:t>
+        <w:t>On application start, render the cached shell, theme, navigation skeleton and last-known non-sensitive display profile immediately. Mark the session as restoring; cached data may improve appearance but cannot authorize protected reads, writes or provider actions.</w:t>
       </w:r>
     </w:p>
     <w:p>
@@ -2632,7 +2735,7 @@
         <w:spacing w:after="80"/>
       </w:pPr>
       <w:r>
-        <w:t>The server verifies a modern password hash or performs a one-time legacy verification, resolves the canonical users/{uid} record, and checks account status.</w:t>
+        <w:t>Firebase Auth restores its persisted session locally and refreshes the ID token in the background. On a valid token, AuthContext activates the cached user partition and begins stale-while-revalidate updates; this is the fast returning-user path and normally requires no password entry.</w:t>
       </w:r>
     </w:p>
     <w:p>
@@ -2644,7 +2747,7 @@
         <w:spacing w:after="80"/>
       </w:pPr>
       <w:r>
-        <w:t>The server issues a Firebase custom token or secure session cookie with server-derived role and permission claims.</w:t>
+        <w:t>For a new or expired session, the existing login form submits credentials to a server-backed login path. Use an indexed normalized-username mapping and a single authentication round trip, then issue the Firebase token/session needed by current screens.</w:t>
       </w:r>
     </w:p>
     <w:p>
@@ -2656,7 +2759,7 @@
         <w:spacing w:after="80"/>
       </w:pPr>
       <w:r>
-        <w:t>The browser signs in with Firebase Auth; the existing AuthContext exposes the same user shape to current pages through a compatibility adapter.</w:t>
+        <w:t>The existing SystemUser-shaped currentUser remains available through a compatibility adapter. Cached name, avatar and menu hints may display immediately, but role/permission decisions come from verified token claims and server guards.</w:t>
       </w:r>
     </w:p>
     <w:p>
@@ -2668,7 +2771,7 @@
         <w:spacing w:after="80"/>
       </w:pPr>
       <w:r>
-        <w:t>Middleware and API guards verify the token/cookie on every protected request; Firestore and Storage rules evaluate the same canonical identity and claims.</w:t>
+        <w:t>Pages render cached route data first, show a freshness indicator when appropriate, and revalidate only stale or changed datasets. Critical financial/administrative mutations wait for server confirmation even when the UI uses optimistic feedback.</w:t>
       </w:r>
     </w:p>
     <w:p>
@@ -2680,7 +2783,7 @@
         <w:spacing w:after="80"/>
       </w:pPr>
       <w:r>
-        <w:t>Authorization, validation, rate limits and idempotency are applied before any database, file, provider, or financial side effect.</w:t>
+        <w:t>On logout or account switch, revoke/clear the session, close listeners, and remove the authenticated user's sensitive cache partition. Public static/reference cache may remain when it contains no personal or restricted school data.</w:t>
       </w:r>
     </w:p>
     <w:p>
@@ -2749,6 +2852,446 @@
       </w:pPr>
       <w:r>
         <w:t>Retries use backoff and the same idempotency key; audit logs exclude secrets and sensitive payloads.</w:t>
+      </w:r>
+    </w:p>
+    <w:p>
+      <w:pPr>
+        <w:pStyle w:val="Heading2"/>
+      </w:pPr>
+      <w:r>
+        <w:t>In-app provider credential management flow</w:t>
+      </w:r>
+    </w:p>
+    <w:p>
+      <w:r>
+        <w:rPr>
+          <w:b/>
+        </w:rPr>
+        <w:t xml:space="preserve">Important distinction: </w:t>
+      </w:r>
+      <w:r>
+        <w:t>some API identifiers are designed to be public in browser code, while SMS, payment, webhook and administrative credentials are private. The revised solution lets an administrator enter private credentials from a frontend settings screen without storing or using those credentials in the frontend.</w:t>
+      </w:r>
+    </w:p>
+    <w:tbl>
+      <w:tblPr>
+        <w:tblStyle w:val="TableGrid"/>
+        <w:tblW w:type="dxa" w:w="9360"/>
+        <w:jc w:val="center"/>
+        <w:tblLayout w:type="fixed"/>
+        <w:tblLook w:firstColumn="1" w:firstRow="1" w:lastColumn="0" w:lastRow="0" w:noHBand="0" w:noVBand="1" w:val="04A0"/>
+        <w:tblInd w:w="120" w:type="dxa"/>
+      </w:tblPr>
+      <w:tblGrid>
+        <w:gridCol w:w="3240"/>
+        <w:gridCol w:w="1944"/>
+        <w:gridCol w:w="4176"/>
+      </w:tblGrid>
+      <w:tr>
+        <w:trPr>
+          <w:tblHeader w:val="true"/>
+        </w:trPr>
+        <w:tc>
+          <w:tcPr>
+            <w:tcW w:type="dxa" w:w="3240"/>
+            <w:tcMar>
+              <w:top w:w="80" w:type="dxa"/>
+              <w:start w:w="120" w:type="dxa"/>
+              <w:bottom w:w="80" w:type="dxa"/>
+              <w:end w:w="120" w:type="dxa"/>
+            </w:tcMar>
+            <w:vAlign w:val="center"/>
+            <w:shd w:fill="E8EEF5"/>
+          </w:tcPr>
+          <w:p>
+            <w:pPr>
+              <w:spacing w:before="0" w:after="40" w:line="252" w:lineRule="auto"/>
+            </w:pPr>
+            <w:r>
+              <w:rPr>
+                <w:rFonts w:ascii="Calibri" w:hAnsi="Calibri"/>
+                <w:b/>
+                <w:color w:val="17365D"/>
+                <w:sz w:val="15"/>
+              </w:rPr>
+              <w:t>Credential type</w:t>
+            </w:r>
+          </w:p>
+        </w:tc>
+        <w:tc>
+          <w:tcPr>
+            <w:tcW w:type="dxa" w:w="1944"/>
+            <w:tcMar>
+              <w:top w:w="80" w:type="dxa"/>
+              <w:start w:w="120" w:type="dxa"/>
+              <w:bottom w:w="80" w:type="dxa"/>
+              <w:end w:w="120" w:type="dxa"/>
+            </w:tcMar>
+            <w:vAlign w:val="center"/>
+            <w:shd w:fill="E8EEF5"/>
+          </w:tcPr>
+          <w:p>
+            <w:pPr>
+              <w:spacing w:before="0" w:after="40" w:line="252" w:lineRule="auto"/>
+            </w:pPr>
+            <w:r>
+              <w:rPr>
+                <w:rFonts w:ascii="Calibri" w:hAnsi="Calibri"/>
+                <w:b/>
+                <w:color w:val="17365D"/>
+                <w:sz w:val="15"/>
+              </w:rPr>
+              <w:t>May appear in frontend?</w:t>
+            </w:r>
+          </w:p>
+        </w:tc>
+        <w:tc>
+          <w:tcPr>
+            <w:tcW w:type="dxa" w:w="4176"/>
+            <w:tcMar>
+              <w:top w:w="80" w:type="dxa"/>
+              <w:start w:w="120" w:type="dxa"/>
+              <w:bottom w:w="80" w:type="dxa"/>
+              <w:end w:w="120" w:type="dxa"/>
+            </w:tcMar>
+            <w:vAlign w:val="center"/>
+            <w:shd w:fill="E8EEF5"/>
+          </w:tcPr>
+          <w:p>
+            <w:pPr>
+              <w:spacing w:before="0" w:after="40" w:line="252" w:lineRule="auto"/>
+            </w:pPr>
+            <w:r>
+              <w:rPr>
+                <w:rFonts w:ascii="Calibri" w:hAnsi="Calibri"/>
+                <w:b/>
+                <w:color w:val="17365D"/>
+                <w:sz w:val="15"/>
+              </w:rPr>
+              <w:t>Required protection</w:t>
+            </w:r>
+          </w:p>
+        </w:tc>
+      </w:tr>
+      <w:tr>
+        <w:tc>
+          <w:tcPr>
+            <w:tcW w:type="dxa" w:w="3240"/>
+            <w:tcMar>
+              <w:top w:w="80" w:type="dxa"/>
+              <w:start w:w="120" w:type="dxa"/>
+              <w:bottom w:w="80" w:type="dxa"/>
+              <w:end w:w="120" w:type="dxa"/>
+            </w:tcMar>
+            <w:vAlign w:val="center"/>
+          </w:tcPr>
+          <w:p>
+            <w:pPr>
+              <w:spacing w:before="0" w:after="40" w:line="252" w:lineRule="auto"/>
+            </w:pPr>
+            <w:r>
+              <w:rPr>
+                <w:rFonts w:ascii="Calibri" w:hAnsi="Calibri"/>
+                <w:b w:val="0"/>
+                <w:sz w:val="15"/>
+              </w:rPr>
+              <w:t>Public client configuration (for example Firebase web config)</w:t>
+            </w:r>
+          </w:p>
+        </w:tc>
+        <w:tc>
+          <w:tcPr>
+            <w:tcW w:type="dxa" w:w="1944"/>
+            <w:tcMar>
+              <w:top w:w="80" w:type="dxa"/>
+              <w:start w:w="120" w:type="dxa"/>
+              <w:bottom w:w="80" w:type="dxa"/>
+              <w:end w:w="120" w:type="dxa"/>
+            </w:tcMar>
+            <w:vAlign w:val="center"/>
+          </w:tcPr>
+          <w:p>
+            <w:pPr>
+              <w:spacing w:before="0" w:after="40" w:line="252" w:lineRule="auto"/>
+            </w:pPr>
+            <w:r>
+              <w:rPr>
+                <w:rFonts w:ascii="Calibri" w:hAnsi="Calibri"/>
+                <w:b w:val="0"/>
+                <w:sz w:val="15"/>
+              </w:rPr>
+              <w:t>Yes, when the provider documents it as public</w:t>
+            </w:r>
+          </w:p>
+        </w:tc>
+        <w:tc>
+          <w:tcPr>
+            <w:tcW w:type="dxa" w:w="4176"/>
+            <w:tcMar>
+              <w:top w:w="80" w:type="dxa"/>
+              <w:start w:w="120" w:type="dxa"/>
+              <w:bottom w:w="80" w:type="dxa"/>
+              <w:end w:w="120" w:type="dxa"/>
+            </w:tcMar>
+            <w:vAlign w:val="center"/>
+          </w:tcPr>
+          <w:p>
+            <w:pPr>
+              <w:spacing w:before="0" w:after="40" w:line="252" w:lineRule="auto"/>
+            </w:pPr>
+            <w:r>
+              <w:rPr>
+                <w:rFonts w:ascii="Calibri" w:hAnsi="Calibri"/>
+                <w:b w:val="0"/>
+                <w:sz w:val="15"/>
+              </w:rPr>
+              <w:t>Domain/app restrictions, App Check where supported, least privilege, quotas and monitoring.</w:t>
+            </w:r>
+          </w:p>
+        </w:tc>
+      </w:tr>
+      <w:tr>
+        <w:tc>
+          <w:tcPr>
+            <w:tcW w:type="dxa" w:w="3240"/>
+            <w:tcMar>
+              <w:top w:w="80" w:type="dxa"/>
+              <w:start w:w="120" w:type="dxa"/>
+              <w:bottom w:w="80" w:type="dxa"/>
+              <w:end w:w="120" w:type="dxa"/>
+            </w:tcMar>
+            <w:vAlign w:val="center"/>
+          </w:tcPr>
+          <w:p>
+            <w:pPr>
+              <w:spacing w:before="0" w:after="40" w:line="252" w:lineRule="auto"/>
+            </w:pPr>
+            <w:r>
+              <w:rPr>
+                <w:rFonts w:ascii="Calibri" w:hAnsi="Calibri"/>
+                <w:b w:val="0"/>
+                <w:sz w:val="15"/>
+              </w:rPr>
+              <w:t>Restricted browser key (for example a map key)</w:t>
+            </w:r>
+          </w:p>
+        </w:tc>
+        <w:tc>
+          <w:tcPr>
+            <w:tcW w:type="dxa" w:w="1944"/>
+            <w:tcMar>
+              <w:top w:w="80" w:type="dxa"/>
+              <w:start w:w="120" w:type="dxa"/>
+              <w:bottom w:w="80" w:type="dxa"/>
+              <w:end w:w="120" w:type="dxa"/>
+            </w:tcMar>
+            <w:vAlign w:val="center"/>
+          </w:tcPr>
+          <w:p>
+            <w:pPr>
+              <w:spacing w:before="0" w:after="40" w:line="252" w:lineRule="auto"/>
+            </w:pPr>
+            <w:r>
+              <w:rPr>
+                <w:rFonts w:ascii="Calibri" w:hAnsi="Calibri"/>
+                <w:b w:val="0"/>
+                <w:sz w:val="15"/>
+              </w:rPr>
+              <w:t>Only when explicitly intended for browser use</w:t>
+            </w:r>
+          </w:p>
+        </w:tc>
+        <w:tc>
+          <w:tcPr>
+            <w:tcW w:type="dxa" w:w="4176"/>
+            <w:tcMar>
+              <w:top w:w="80" w:type="dxa"/>
+              <w:start w:w="120" w:type="dxa"/>
+              <w:bottom w:w="80" w:type="dxa"/>
+              <w:end w:w="120" w:type="dxa"/>
+            </w:tcMar>
+            <w:vAlign w:val="center"/>
+          </w:tcPr>
+          <w:p>
+            <w:pPr>
+              <w:spacing w:before="0" w:after="40" w:line="252" w:lineRule="auto"/>
+            </w:pPr>
+            <w:r>
+              <w:rPr>
+                <w:rFonts w:ascii="Calibri" w:hAnsi="Calibri"/>
+                <w:b w:val="0"/>
+                <w:sz w:val="15"/>
+              </w:rPr>
+              <w:t>Exact domain/API restrictions, low quota, separate key per environment, rapid rotation.</w:t>
+            </w:r>
+          </w:p>
+        </w:tc>
+      </w:tr>
+      <w:tr>
+        <w:tc>
+          <w:tcPr>
+            <w:tcW w:type="dxa" w:w="3240"/>
+            <w:tcMar>
+              <w:top w:w="80" w:type="dxa"/>
+              <w:start w:w="120" w:type="dxa"/>
+              <w:bottom w:w="80" w:type="dxa"/>
+              <w:end w:w="120" w:type="dxa"/>
+            </w:tcMar>
+            <w:vAlign w:val="center"/>
+          </w:tcPr>
+          <w:p>
+            <w:pPr>
+              <w:spacing w:before="0" w:after="40" w:line="252" w:lineRule="auto"/>
+            </w:pPr>
+            <w:r>
+              <w:rPr>
+                <w:rFonts w:ascii="Calibri" w:hAnsi="Calibri"/>
+                <w:b w:val="0"/>
+                <w:sz w:val="15"/>
+              </w:rPr>
+              <w:t>Private provider secret, password, bearer token or webhook secret</w:t>
+            </w:r>
+          </w:p>
+        </w:tc>
+        <w:tc>
+          <w:tcPr>
+            <w:tcW w:type="dxa" w:w="1944"/>
+            <w:tcMar>
+              <w:top w:w="80" w:type="dxa"/>
+              <w:start w:w="120" w:type="dxa"/>
+              <w:bottom w:w="80" w:type="dxa"/>
+              <w:end w:w="120" w:type="dxa"/>
+            </w:tcMar>
+            <w:vAlign w:val="center"/>
+          </w:tcPr>
+          <w:p>
+            <w:pPr>
+              <w:spacing w:before="0" w:after="40" w:line="252" w:lineRule="auto"/>
+            </w:pPr>
+            <w:r>
+              <w:rPr>
+                <w:rFonts w:ascii="Calibri" w:hAnsi="Calibri"/>
+                <w:b w:val="0"/>
+                <w:sz w:val="15"/>
+              </w:rPr>
+              <w:t>No</w:t>
+            </w:r>
+          </w:p>
+        </w:tc>
+        <w:tc>
+          <w:tcPr>
+            <w:tcW w:type="dxa" w:w="4176"/>
+            <w:tcMar>
+              <w:top w:w="80" w:type="dxa"/>
+              <w:start w:w="120" w:type="dxa"/>
+              <w:bottom w:w="80" w:type="dxa"/>
+              <w:end w:w="120" w:type="dxa"/>
+            </w:tcMar>
+            <w:vAlign w:val="center"/>
+          </w:tcPr>
+          <w:p>
+            <w:pPr>
+              <w:spacing w:before="0" w:after="40" w:line="252" w:lineRule="auto"/>
+            </w:pPr>
+            <w:r>
+              <w:rPr>
+                <w:rFonts w:ascii="Calibri" w:hAnsi="Calibri"/>
+                <w:b w:val="0"/>
+                <w:sz w:val="15"/>
+              </w:rPr>
+              <w:t>Enter through the admin UI, transmit once to a protected Firebase Function, store in Secret Manager, and use only inside server functions.</w:t>
+            </w:r>
+          </w:p>
+        </w:tc>
+      </w:tr>
+    </w:tbl>
+    <w:p>
+      <w:pPr>
+        <w:spacing w:after="0"/>
+      </w:pPr>
+    </w:p>
+    <w:p>
+      <w:pPr>
+        <w:spacing w:after="80"/>
+        <w:numPr>
+          <w:ilvl w:val="0"/>
+          <w:numId w:val="10"/>
+        </w:numPr>
+      </w:pPr>
+      <w:r>
+        <w:t>An administrator with integration.manage permission opens Settings -&gt; Integrations. The screen shows provider status, last four characters, validation result and last rotation date; it never loads the current secret.</w:t>
+      </w:r>
+    </w:p>
+    <w:p>
+      <w:pPr>
+        <w:spacing w:after="80"/>
+        <w:numPr>
+          <w:ilvl w:val="0"/>
+          <w:numId w:val="10"/>
+        </w:numPr>
+      </w:pPr>
+      <w:r>
+        <w:t>Before save or rotation, require a fresh Firebase authentication check and, where available, MFA. The browser sends the new value over HTTPS directly to a dedicated Firebase callable/HTTP function with the Firebase ID token.</w:t>
+      </w:r>
+    </w:p>
+    <w:p>
+      <w:pPr>
+        <w:spacing w:after="80"/>
+        <w:numPr>
+          <w:ilvl w:val="0"/>
+          <w:numId w:val="10"/>
+        </w:numPr>
+      </w:pPr>
+      <w:r>
+        <w:t>The function verifies administrator permission, App Check/CSRF requirements, rate limits and payload shape before touching the secret. Request bodies and headers are excluded from logs and error responses.</w:t>
+      </w:r>
+    </w:p>
+    <w:p>
+      <w:pPr>
+        <w:spacing w:after="80"/>
+        <w:numPr>
+          <w:ilvl w:val="0"/>
+          <w:numId w:val="10"/>
+        </w:numPr>
+      </w:pPr>
+      <w:r>
+        <w:t>Using the Firebase/Google Cloud runtime service identity, the function creates a new version in Google Secret Manager. This avoids a Vercel environment-variable edit and avoids giving the browser or Vercel deployment the provider secret.</w:t>
+      </w:r>
+    </w:p>
+    <w:p>
+      <w:pPr>
+        <w:spacing w:after="80"/>
+        <w:numPr>
+          <w:ilvl w:val="0"/>
+          <w:numId w:val="10"/>
+        </w:numPr>
+      </w:pPr>
+      <w:r>
+        <w:t>The same function validates the credential with a harmless provider operation. Firestore stores metadata only: configured flag, provider, secret version, last four characters, validation status, updatedAt and updatedBy.</w:t>
+      </w:r>
+    </w:p>
+    <w:p>
+      <w:pPr>
+        <w:spacing w:after="80"/>
+        <w:numPr>
+          <w:ilvl w:val="0"/>
+          <w:numId w:val="10"/>
+        </w:numPr>
+      </w:pPr>
+      <w:r>
+        <w:t>SMS/payment/provider operations execute in a Firebase Function or Cloud Run service that reads the secret at runtime. The secret is never returned to the browser. If a Vercel route initiates the action, it calls this broker operation rather than receiving the raw key.</w:t>
+      </w:r>
+    </w:p>
+    <w:p>
+      <w:pPr>
+        <w:spacing w:after="80"/>
+        <w:numPr>
+          <w:ilvl w:val="0"/>
+          <w:numId w:val="10"/>
+        </w:numPr>
+      </w:pPr>
+      <w:r>
+        <w:t>Rotation creates a new secret version, validates it, switches active metadata atomically, monitors provider success and then disables the old version after a short rollback window. Every change creates an immutable audit event.</w:t>
       </w:r>
     </w:p>
     <w:p>
@@ -2869,14 +3412,15 @@
           </w:tcPr>
           <w:p>
             <w:pPr>
-              <w:spacing w:after="40" w:before="0" w:line="252" w:lineRule="auto"/>
-            </w:pPr>
-            <w:r>
-              <w:rPr>
-                <w:rFonts w:ascii="Calibri" w:hAnsi="Calibri"/>
+              <w:spacing w:before="0" w:after="40" w:line="252" w:lineRule="auto"/>
+            </w:pPr>
+            <w:r>
+              <w:rPr>
+                <w:rFonts w:ascii="Calibri" w:hAnsi="Calibri"/>
+                <w:b w:val="0"/>
                 <w:sz w:val="17"/>
               </w:rPr>
-              <w:t>Backups restored in staging; critical smoke suite passes on a known-good tag.</w:t>
+              <w:t>Backups restore in staging; critical smoke tests pass; live login/cache/read-write performance baseline and rollback thresholds are recorded.</w:t>
             </w:r>
           </w:p>
         </w:tc>
@@ -2919,14 +3463,15 @@
           </w:tcPr>
           <w:p>
             <w:pPr>
-              <w:spacing w:after="40" w:before="0" w:line="252" w:lineRule="auto"/>
-            </w:pPr>
-            <w:r>
-              <w:rPr>
-                <w:rFonts w:ascii="Calibri" w:hAnsi="Calibri"/>
+              <w:spacing w:before="0" w:after="40" w:line="252" w:lineRule="auto"/>
+            </w:pPr>
+            <w:r>
+              <w:rPr>
+                <w:rFonts w:ascii="Calibri" w:hAnsi="Calibri"/>
+                <w:b w:val="0"/>
                 <w:sz w:val="17"/>
               </w:rPr>
-              <w:t>Credentials rotated; setup path inaccessible; public costly/destructive calls rejected.</w:t>
+              <w:t>Credentials are rotated; source fallbacks are gone; Settings -&gt; Integrations stores private values through the Firebase secret broker; costly/destructive anonymous calls are rejected.</w:t>
             </w:r>
           </w:p>
         </w:tc>
@@ -2969,14 +3514,15 @@
           </w:tcPr>
           <w:p>
             <w:pPr>
-              <w:spacing w:after="40" w:before="0" w:line="252" w:lineRule="auto"/>
-            </w:pPr>
-            <w:r>
-              <w:rPr>
-                <w:rFonts w:ascii="Calibri" w:hAnsi="Calibri"/>
+              <w:spacing w:before="0" w:after="40" w:line="252" w:lineRule="auto"/>
+            </w:pPr>
+            <w:r>
+              <w:rPr>
+                <w:rFonts w:ascii="Calibri" w:hAnsi="Calibri"/>
+                <w:b w:val="0"/>
                 <w:sz w:val="17"/>
               </w:rPr>
-              <w:t>Trusted Firebase identity works while current screens and user workflows remain unchanged.</w:t>
+              <w:t>Verified Firebase identity works through the current UI contract; warm/cold login and Firestore reads per session are no worse than the live baseline.</w:t>
             </w:r>
           </w:p>
         </w:tc>
@@ -3119,14 +3665,15 @@
           </w:tcPr>
           <w:p>
             <w:pPr>
-              <w:spacing w:after="40" w:before="0" w:line="252" w:lineRule="auto"/>
-            </w:pPr>
-            <w:r>
-              <w:rPr>
-                <w:rFonts w:ascii="Calibri" w:hAnsi="Calibri"/>
+              <w:spacing w:before="0" w:after="40" w:line="252" w:lineRule="auto"/>
+            </w:pPr>
+            <w:r>
+              <w:rPr>
+                <w:rFonts w:ascii="Calibri" w:hAnsi="Calibri"/>
+                <w:b w:val="0"/>
                 <w:sz w:val="17"/>
               </w:rPr>
-              <w:t>Every route has an explicit caller policy; webhook/cron/SMS replay tests pass.</w:t>
+              <w:t>Every route has an explicit caller policy; private provider calls execute server-side through Secret Manager; webhook/cron/SMS replay tests pass.</w:t>
             </w:r>
           </w:p>
         </w:tc>
@@ -3319,14 +3866,15 @@
           </w:tcPr>
           <w:p>
             <w:pPr>
-              <w:spacing w:after="40" w:before="0" w:line="252" w:lineRule="auto"/>
-            </w:pPr>
-            <w:r>
-              <w:rPr>
-                <w:rFonts w:ascii="Calibri" w:hAnsi="Calibri"/>
+              <w:spacing w:before="0" w:after="40" w:line="252" w:lineRule="auto"/>
+            </w:pPr>
+            <w:r>
+              <w:rPr>
+                <w:rFonts w:ascii="Calibri" w:hAnsi="Calibri"/>
+                <w:b w:val="0"/>
                 <w:sz w:val="17"/>
               </w:rPr>
-              <w:t>Role-aware loading meets budgets without changing visible workflow behavior.</w:t>
+              <w:t>UID/school/version-partitioned caching preserves cached-first speed, slow-network usability and low read/write volume without cross-account exposure.</w:t>
             </w:r>
           </w:p>
         </w:tc>
@@ -3392,7 +3940,7 @@
         <w:pStyle w:val="Heading1"/>
       </w:pPr>
       <w:r>
-        <w:t>Phase 0 — Establish a reversible safety net</w:t>
+        <w:t>Phase 0 — Establish a live-production safety net and performance baseline</w:t>
       </w:r>
     </w:p>
     <w:tbl>
@@ -3537,7 +4085,7 @@
         <w:t xml:space="preserve">Problem: </w:t>
       </w:r>
       <w:r>
-        <w:t>The repository is already dirty and the application lacks reliable automated regression gates. Security work will touch authentication, rules, integrations, and cached data; a mistake can lock users out or corrupt records.</w:t>
+        <w:t>The application is already live, the repository has active uncommitted work, and reliable automated regression gates are limited. Security changes will touch identity, rules, integrations and caches while real users continue working.</w:t>
       </w:r>
     </w:p>
     <w:p>
@@ -3572,7 +4120,7 @@
         <w:spacing w:after="80"/>
       </w:pPr>
       <w:r>
-        <w:t>Inventory the current 56 working-tree changes and assign each to its owner. Do not discard, reset, or mix them with remediation changes.</w:t>
+        <w:t>Place production under controlled change: emergency containment and reviewed fixes may continue, but unrelated high-risk releases should wait until backups, monitoring and rollback are confirmed. Do not shut down normal school use solely because this runbook exists.</w:t>
       </w:r>
     </w:p>
     <w:p>
@@ -3584,7 +4132,7 @@
         <w:spacing w:after="80"/>
       </w:pPr>
       <w:r>
-        <w:t>Create a protected production tag and a separate codex/production-safety branch from the exact deployed commit—not from an unknown local state.</w:t>
+        <w:t>Inventory the current working-tree changes and assign each to its owner. Create the remediation branch from the exact deployed commit and keep unrelated user work separate.</w:t>
       </w:r>
     </w:p>
     <w:p>
@@ -3596,7 +4144,7 @@
         <w:spacing w:after="80"/>
       </w:pPr>
       <w:r>
-        <w:t>Export Firestore, Storage and Firebase Authentication data using provider-supported backups. Record project id, backup time, encryption/access location, retention, and restore command.</w:t>
+        <w:t>Export Firestore, Storage and Firebase Authentication data using provider-supported backups. Record project, backup time, access location, retention and tested restore command.</w:t>
       </w:r>
     </w:p>
     <w:p>
@@ -3608,7 +4156,7 @@
         <w:spacing w:after="80"/>
       </w:pPr>
       <w:r>
-        <w:t>Create a separate staging Firebase project and Vercel environment with synthetic or anonymized data. Never point staging at production Firestore or provider accounts.</w:t>
+        <w:t>Create a separate staging Firebase project and Vercel environment with synthetic/anonymized data and non-production provider accounts. Never point staging at production data or SMS/payment balances.</w:t>
       </w:r>
     </w:p>
     <w:p>
@@ -3620,7 +4168,7 @@
         <w:spacing w:after="80"/>
       </w:pPr>
       <w:r>
-        <w:t>Document the current login, role navigation, pupil management, staff management, fee posting, SchoolPay webhook, scheduled SMS, notification, photo upload/delete, reporting and logout flows.</w:t>
+        <w:t>Measure current production performance before changing cache or login: warm restore, cold login, common route render, Firestore reads/writes per session, active listener count, cache hit rate and error rate.</w:t>
       </w:r>
     </w:p>
     <w:p>
@@ -3632,7 +4180,7 @@
         <w:spacing w:after="80"/>
       </w:pPr>
       <w:r>
-        <w:t>Automate the most critical flows as characterization tests. These tests initially preserve observable behavior; security assertions are added as controls are implemented.</w:t>
+        <w:t>Automate the critical login, role navigation, pupil, staff, fees, SchoolPay, SMS, notifications, files, reports and logout flows as characterization tests.</w:t>
       </w:r>
     </w:p>
     <w:p>
@@ -3644,7 +4192,7 @@
         <w:spacing w:after="80"/>
       </w:pPr>
       <w:r>
-        <w:t>Perform a restore rehearsal into staging and time it. A backup that has never been restored is not a proven rollback mechanism.</w:t>
+        <w:t>Perform a restore rehearsal in staging and a canary/rollback rehearsal. A backup or feature flag that has never been exercised is not a proven safety control.</w:t>
       </w:r>
     </w:p>
     <w:tbl>
@@ -3694,11 +4242,7 @@
               <w:spacing w:after="40" w:line="252" w:lineRule="auto" w:before="0"/>
             </w:pPr>
             <w:r>
-              <w:rPr>
-                <w:rFonts w:ascii="Calibri" w:hAnsi="Calibri"/>
-                <w:sz w:val="19"/>
-              </w:rPr>
-              <w:t>No production rules, schema, or authentication behavior changes in this phase. The goal is to make later changes observable and reversible.</w:t>
+              <w:t>No production rules, schema, login contract or cache removal occurs in this phase. The purpose is to make later security changes observable, performance-neutral or better, and reversible while users remain active.</w:t>
             </w:r>
           </w:p>
         </w:tc>
@@ -3962,7 +4506,7 @@
         <w:spacing w:after="80"/>
       </w:pPr>
       <w:r>
-        <w:t>Rotate every SMS/Wiza/provider credential found in source or deployment history. Revoke old values first where provider continuity allows; otherwise create new values, deploy them, verify, then revoke old values within the same maintenance window.</w:t>
+        <w:t>Rotate every SMS/Wiza/payment/provider credential found in source or deployment history. Create and validate the replacement first when continuity requires it, switch traffic, then revoke the old value within the same controlled maintenance window.</w:t>
       </w:r>
     </w:p>
     <w:p>
@@ -3974,7 +4518,7 @@
         <w:spacing w:after="80"/>
       </w:pPr>
       <w:r>
-        <w:t>Move secrets to server-only environment/secret storage. Remove all production-looking fallbacks from functions/index.js and fail startup or the individual operation when a required secret is absent.</w:t>
+        <w:t>Create Settings -&gt; Integrations and the protected Firebase secret-broker function. Store private values in Google Secret Manager using the function runtime identity; store only non-secret metadata in Firestore. This removes the requirement for routine Vercel environment-variable editing.</w:t>
       </w:r>
     </w:p>
     <w:p>
@@ -3986,7 +4530,7 @@
         <w:spacing w:after="80"/>
       </w:pPr>
       <w:r>
-        <w:t>Search current files, Git history, build logs and deployment logs for the old values. Add secret scanning to CI and pre-commit guidance.</w:t>
+        <w:t>Remove all production-looking fallbacks from functions/index.js. A missing secret must mark that integration unavailable with a clear operator status; it must never silently fall back to a source-code value.</w:t>
       </w:r>
     </w:p>
     <w:p>
@@ -3998,7 +4542,7 @@
         <w:spacing w:after="80"/>
       </w:pPr>
       <w:r>
-        <w:t>Remove src/app/admin/setup/page.tsx from production routing or require a one-time server-side bootstrap token, allow-listed operator identity, audit log, and automatic permanent disable after use. Preferred production state: no browser-accessible bootstrap page.</w:t>
+        <w:t>Search current files, Git history, build logs and deployment logs for old values. Add secret scanning and create an audit record for every in-app save, validation, rotation, disable and rollback.</w:t>
       </w:r>
     </w:p>
     <w:p>
@@ -4010,7 +4554,7 @@
         <w:spacing w:after="80"/>
       </w:pPr>
       <w:r>
-        <w:t>Add an emergency ingress guard to costly/destructive endpoints: verified bearer token for jobs, verified Firebase user plus admin permission for admin mutations, and provider signature for webhooks.</w:t>
+        <w:t>Remove the browser-accessible admin bootstrap or require a one-time server-side bootstrap process that permanently disables itself. Verify an existing administrator before removing it.</w:t>
       </w:r>
     </w:p>
     <w:p>
@@ -4022,7 +4566,7 @@
         <w:spacing w:after="80"/>
       </w:pPr>
       <w:r>
-        <w:t>Apply temporary per-IP/per-user limits to SMS, file generation/upload and bulk operations until the full shared guard layer is deployed.</w:t>
+        <w:t>Apply emergency verified-caller guards and temporary per-user/IP/provider quotas to costly or destructive endpoints. Start with internal canaries and monitor latency/error rate so containment does not interrupt legitimate school operations.</w:t>
       </w:r>
     </w:p>
     <w:tbl>
@@ -4414,7 +4958,7 @@
         <w:pStyle w:val="Heading1"/>
       </w:pPr>
       <w:r>
-        <w:t>Phase 2 — Replace forgeable browser authentication with a server-backed bridge</w:t>
+        <w:t>Phase 2 — Secure login without sacrificing fast sign-in</w:t>
       </w:r>
     </w:p>
     <w:tbl>
@@ -4559,7 +5103,7 @@
         <w:t xml:space="preserve">Problem: </w:t>
       </w:r>
       <w:r>
-        <w:t>users.service.ts performs custom browser authentication and uses a fixed-salt Base64 password representation. auth-context.tsx restores a cached user object from localStorage indefinitely. That object is not proof that Firebase or the server authenticated the person.</w:t>
+        <w:t>Fast login is an intentional product requirement, but users.service.ts performs password verification in the browser and auth-context.tsx can restore a cached localStorage user as if it were authenticated. The issue is not caching itself; it is using unsigned cached state as proof of identity.</w:t>
       </w:r>
     </w:p>
     <w:p>
@@ -4574,7 +5118,7 @@
         <w:t xml:space="preserve">Risk: </w:t>
       </w:r>
       <w:r>
-        <w:t>A user can alter browser storage or application state to impersonate a role. Password disclosure is far more damaging because the representation is not a modern slow, salted password hash. Restrictive rules cannot rely on this identity.</w:t>
+        <w:t>A modified browser value can impersonate a role, while removing all persistence would make the live application slower and increase reads. The countermeasure must preserve warm-session speed and reduce database work while moving authorization trust to Firebase-verified tokens and server guards.</w:t>
       </w:r>
     </w:p>
     <w:p>
@@ -4589,9 +5133,9 @@
       <w:tblPr>
         <w:tblStyle w:val="TableGrid"/>
         <w:tblW w:type="dxa" w:w="9360"/>
-        <w:jc w:val="center"/>
         <w:tblLayout w:type="fixed"/>
         <w:tblLook w:firstColumn="1" w:firstRow="1" w:lastColumn="0" w:lastRow="0" w:noHBand="0" w:noVBand="1" w:val="04A0"/>
+        <w:jc w:val="center"/>
         <w:tblInd w:w="120" w:type="dxa"/>
       </w:tblPr>
       <w:tblGrid>
@@ -4623,7 +5167,7 @@
                 <w:rFonts w:ascii="Calibri" w:hAnsi="Calibri"/>
                 <w:b/>
                 <w:color w:val="17365D"/>
-                <w:sz w:val="17"/>
+                <w:sz w:val="16"/>
               </w:rPr>
               <w:t>Existing contract to preserve</w:t>
             </w:r>
@@ -4650,7 +5194,7 @@
                 <w:rFonts w:ascii="Calibri" w:hAnsi="Calibri"/>
                 <w:b/>
                 <w:color w:val="17365D"/>
-                <w:sz w:val="17"/>
+                <w:sz w:val="16"/>
               </w:rPr>
               <w:t>New secure implementation behind it</w:t>
             </w:r>
@@ -4671,12 +5215,13 @@
           </w:tcPr>
           <w:p>
             <w:pPr>
-              <w:spacing w:after="40" w:before="0" w:line="252" w:lineRule="auto"/>
-            </w:pPr>
-            <w:r>
-              <w:rPr>
-                <w:rFonts w:ascii="Calibri" w:hAnsi="Calibri"/>
-                <w:sz w:val="17"/>
+              <w:spacing w:before="0" w:after="40" w:line="252" w:lineRule="auto"/>
+            </w:pPr>
+            <w:r>
+              <w:rPr>
+                <w:rFonts w:ascii="Calibri" w:hAnsi="Calibri"/>
+                <w:b w:val="0"/>
+                <w:sz w:val="16"/>
               </w:rPr>
               <w:t>AuthContext.login(username, password)</w:t>
             </w:r>
@@ -4695,14 +5240,15 @@
           </w:tcPr>
           <w:p>
             <w:pPr>
-              <w:spacing w:after="40" w:before="0" w:line="252" w:lineRule="auto"/>
-            </w:pPr>
-            <w:r>
-              <w:rPr>
-                <w:rFonts w:ascii="Calibri" w:hAnsi="Calibri"/>
-                <w:sz w:val="17"/>
-              </w:rPr>
-              <w:t>POST credentials to a server-only login endpoint; never query password material from the browser.</w:t>
+              <w:spacing w:before="0" w:after="40" w:line="252" w:lineRule="auto"/>
+            </w:pPr>
+            <w:r>
+              <w:rPr>
+                <w:rFonts w:ascii="Calibri" w:hAnsi="Calibri"/>
+                <w:b w:val="0"/>
+                <w:sz w:val="16"/>
+              </w:rPr>
+              <w:t>Keep the interface; use one indexed username lookup and a server/Firebase authentication exchange. Never query password material from the browser.</w:t>
             </w:r>
           </w:p>
         </w:tc>
@@ -4721,14 +5267,15 @@
           </w:tcPr>
           <w:p>
             <w:pPr>
-              <w:spacing w:after="40" w:before="0" w:line="252" w:lineRule="auto"/>
-            </w:pPr>
-            <w:r>
-              <w:rPr>
-                <w:rFonts w:ascii="Calibri" w:hAnsi="Calibri"/>
-                <w:sz w:val="17"/>
-              </w:rPr>
-              <w:t>SystemUser-shaped currentUser</w:t>
+              <w:spacing w:before="0" w:after="40" w:line="252" w:lineRule="auto"/>
+            </w:pPr>
+            <w:r>
+              <w:rPr>
+                <w:rFonts w:ascii="Calibri" w:hAnsi="Calibri"/>
+                <w:b w:val="0"/>
+                <w:sz w:val="16"/>
+              </w:rPr>
+              <w:t>Instant returning-user experience</w:t>
             </w:r>
           </w:p>
         </w:tc>
@@ -4745,14 +5292,15 @@
           </w:tcPr>
           <w:p>
             <w:pPr>
-              <w:spacing w:after="40" w:before="0" w:line="252" w:lineRule="auto"/>
-            </w:pPr>
-            <w:r>
-              <w:rPr>
-                <w:rFonts w:ascii="Calibri" w:hAnsi="Calibri"/>
-                <w:sz w:val="17"/>
-              </w:rPr>
-              <w:t>Map canonical users/{uid} to the existing shape through toSystemUser() so pages do not need a simultaneous rewrite.</w:t>
+              <w:spacing w:before="0" w:after="40" w:line="252" w:lineRule="auto"/>
+            </w:pPr>
+            <w:r>
+              <w:rPr>
+                <w:rFonts w:ascii="Calibri" w:hAnsi="Calibri"/>
+                <w:b w:val="0"/>
+                <w:sz w:val="16"/>
+              </w:rPr>
+              <w:t>Render cached shell/display profile immediately while Firebase restores its persisted session locally; enable protected actions only after token confirmation.</w:t>
             </w:r>
           </w:p>
         </w:tc>
@@ -4771,14 +5319,15 @@
           </w:tcPr>
           <w:p>
             <w:pPr>
-              <w:spacing w:after="40" w:before="0" w:line="252" w:lineRule="auto"/>
-            </w:pPr>
-            <w:r>
-              <w:rPr>
-                <w:rFonts w:ascii="Calibri" w:hAnsi="Calibri"/>
-                <w:sz w:val="17"/>
-              </w:rPr>
-              <w:t>Existing permission checks</w:t>
+              <w:spacing w:before="0" w:after="40" w:line="252" w:lineRule="auto"/>
+            </w:pPr>
+            <w:r>
+              <w:rPr>
+                <w:rFonts w:ascii="Calibri" w:hAnsi="Calibri"/>
+                <w:b w:val="0"/>
+                <w:sz w:val="16"/>
+              </w:rPr>
+              <w:t>SystemUser-shaped currentUser</w:t>
             </w:r>
           </w:p>
         </w:tc>
@@ -4795,14 +5344,15 @@
           </w:tcPr>
           <w:p>
             <w:pPr>
-              <w:spacing w:after="40" w:before="0" w:line="252" w:lineRule="auto"/>
-            </w:pPr>
-            <w:r>
-              <w:rPr>
-                <w:rFonts w:ascii="Calibri" w:hAnsi="Calibri"/>
-                <w:sz w:val="17"/>
-              </w:rPr>
-              <w:t>Resolve permissions server-side into trusted claims and mirror them through a compatibility adapter.</w:t>
+              <w:spacing w:before="0" w:after="40" w:line="252" w:lineRule="auto"/>
+            </w:pPr>
+            <w:r>
+              <w:rPr>
+                <w:rFonts w:ascii="Calibri" w:hAnsi="Calibri"/>
+                <w:b w:val="0"/>
+                <w:sz w:val="16"/>
+              </w:rPr>
+              <w:t>Map the canonical users/{uid} record and verified compact claims through toSystemUser() so existing pages do not require a simultaneous rewrite.</w:t>
             </w:r>
           </w:p>
         </w:tc>
@@ -4821,12 +5371,65 @@
           </w:tcPr>
           <w:p>
             <w:pPr>
-              <w:spacing w:after="40" w:before="0" w:line="252" w:lineRule="auto"/>
-            </w:pPr>
-            <w:r>
-              <w:rPr>
-                <w:rFonts w:ascii="Calibri" w:hAnsi="Calibri"/>
-                <w:sz w:val="17"/>
+              <w:spacing w:before="0" w:after="40" w:line="252" w:lineRule="auto"/>
+            </w:pPr>
+            <w:r>
+              <w:rPr>
+                <w:rFonts w:ascii="Calibri" w:hAnsi="Calibri"/>
+                <w:b w:val="0"/>
+                <w:sz w:val="16"/>
+              </w:rPr>
+              <w:t>Low Firestore read volume</w:t>
+            </w:r>
+          </w:p>
+        </w:tc>
+        <w:tc>
+          <w:tcPr>
+            <w:tcW w:type="dxa" w:w="5904"/>
+            <w:tcMar>
+              <w:top w:w="80" w:type="dxa"/>
+              <w:start w:w="120" w:type="dxa"/>
+              <w:bottom w:w="80" w:type="dxa"/>
+              <w:end w:w="120" w:type="dxa"/>
+            </w:tcMar>
+            <w:vAlign w:val="center"/>
+          </w:tcPr>
+          <w:p>
+            <w:pPr>
+              <w:spacing w:before="0" w:after="40" w:line="252" w:lineRule="auto"/>
+            </w:pPr>
+            <w:r>
+              <w:rPr>
+                <w:rFonts w:ascii="Calibri" w:hAnsi="Calibri"/>
+                <w:b w:val="0"/>
+                <w:sz w:val="16"/>
+              </w:rPr>
+              <w:t>Put stable coarse role/access information in compact Firebase custom claims, cache versioned profile/reference data, and refresh only when permissionVersion changes.</w:t>
+            </w:r>
+          </w:p>
+        </w:tc>
+      </w:tr>
+      <w:tr>
+        <w:tc>
+          <w:tcPr>
+            <w:tcW w:type="dxa" w:w="3456"/>
+            <w:tcMar>
+              <w:top w:w="80" w:type="dxa"/>
+              <w:start w:w="120" w:type="dxa"/>
+              <w:bottom w:w="80" w:type="dxa"/>
+              <w:end w:w="120" w:type="dxa"/>
+            </w:tcMar>
+            <w:vAlign w:val="center"/>
+          </w:tcPr>
+          <w:p>
+            <w:pPr>
+              <w:spacing w:before="0" w:after="40" w:line="252" w:lineRule="auto"/>
+            </w:pPr>
+            <w:r>
+              <w:rPr>
+                <w:rFonts w:ascii="Calibri" w:hAnsi="Calibri"/>
+                <w:b w:val="0"/>
+                <w:sz w:val="16"/>
               </w:rPr>
               <w:t>Existing logout button</w:t>
             </w:r>
@@ -4845,14 +5448,15 @@
           </w:tcPr>
           <w:p>
             <w:pPr>
-              <w:spacing w:after="40" w:before="0" w:line="252" w:lineRule="auto"/>
-            </w:pPr>
-            <w:r>
-              <w:rPr>
-                <w:rFonts w:ascii="Calibri" w:hAnsi="Calibri"/>
-                <w:sz w:val="17"/>
-              </w:rPr>
-              <w:t>Revoke/clear session, Firebase sign-out, local query cache clear, and Firestore persistence/cache handling.</w:t>
+              <w:spacing w:before="0" w:after="40" w:line="252" w:lineRule="auto"/>
+            </w:pPr>
+            <w:r>
+              <w:rPr>
+                <w:rFonts w:ascii="Calibri" w:hAnsi="Calibri"/>
+                <w:b w:val="0"/>
+                <w:sz w:val="16"/>
+              </w:rPr>
+              <w:t>Sign out Firebase, close listeners, clear the current user's sensitive partition and retain only safe public/reference cache.</w:t>
             </w:r>
           </w:p>
         </w:tc>
@@ -4880,7 +5484,7 @@
         <w:spacing w:after="80"/>
       </w:pPr>
       <w:r>
-        <w:t>Define a server-only login endpoint with Zod validation, generic error messages, rate limiting, account status checks, and structured security logging without passwords.</w:t>
+        <w:t>Measure current warm restore and cold login p50/p95 before changing authentication. These numbers become non-regression gates.</w:t>
       </w:r>
     </w:p>
     <w:p>
@@ -4892,7 +5496,7 @@
         <w:spacing w:after="80"/>
       </w:pPr>
       <w:r>
-        <w:t>For users already in Firebase Authentication, verify through the supported Firebase flow. For a legacy system_users account, perform the legacy comparison only on the server and only during a time-limited migration period.</w:t>
+        <w:t>Use Firebase Auth persistence for returning users. AuthContext may show cached display state instantly, but it remains in restoring mode until onAuthStateChanged supplies a valid user and token.</w:t>
       </w:r>
     </w:p>
     <w:p>
@@ -4904,7 +5508,7 @@
         <w:spacing w:after="80"/>
       </w:pPr>
       <w:r>
-        <w:t>Create or resolve a Firebase UID and canonical users/{uid} record. Server-derived role, access level and permissions become the only authorization source.</w:t>
+        <w:t>For typed credentials, use a single indexed normalized-username mapping and server-backed verification. Avoid collection scans and duplicate profile fetches; return the token/session and compact profile in one response.</w:t>
       </w:r>
     </w:p>
     <w:p>
@@ -4916,7 +5520,7 @@
         <w:spacing w:after="80"/>
       </w:pPr>
       <w:r>
-        <w:t>Issue a Firebase custom token for browser sign-in or an HttpOnly, Secure, SameSite session cookie. Prefer a short idle lifetime, bounded absolute lifetime, and revocation on disable/password reset.</w:t>
+        <w:t>For a legacy system_users account, perform the legacy comparison only on the server and only during a time-limited migration. On success, migrate/reset the credential to Firebase or a modern slow salted hash.</w:t>
       </w:r>
     </w:p>
     <w:p>
@@ -4928,7 +5532,7 @@
         <w:spacing w:after="80"/>
       </w:pPr>
       <w:r>
-        <w:t>In AuthContext, keep the public login and currentUser interface stable, but derive authentication state from Firebase onAuthStateChanged and a verified server profile response—not from localStorage.</w:t>
+        <w:t>Place stable coarse role/access data and a permissionVersion in compact Firebase claims so common Firestore/API checks do not require a user-document read on every request. Revoke/refresh tokens when permissions or account status change.</w:t>
       </w:r>
     </w:p>
     <w:p>
@@ -4940,7 +5544,7 @@
         <w:spacing w:after="80"/>
       </w:pPr>
       <w:r>
-        <w:t>Temporarily read the old cached user only to display a migration/loading message; never grant access from it. Delete the cache after the first secure session.</w:t>
+        <w:t>Keep AuthContext.login and the SystemUser UI shape stable through an adapter. Existing pages receive the same fields while trust comes from verified identity.</w:t>
       </w:r>
     </w:p>
     <w:p>
@@ -4952,7 +5556,7 @@
         <w:spacing w:after="80"/>
       </w:pPr>
       <w:r>
-        <w:t>On first successful legacy login, require password reset or re-hash with a modern algorithm. Track migratedAt and legacyAuthDisabled fields; do not retain reversible password material after completion.</w:t>
+        <w:t>Partition cached data by Firebase UID, school/tenant and schema version. Activate a partition only after token confirmation; never let cached role text grant access.</w:t>
       </w:r>
     </w:p>
     <w:p>
@@ -4964,7 +5568,7 @@
         <w:spacing w:after="80"/>
       </w:pPr>
       <w:r>
-        <w:t>Add shared requireUser, requirePermission and requireAdmin server guards. Middleware may redirect for UX, but each API route must independently enforce authorization.</w:t>
+        <w:t>On logout, disable or password change, revoke/clear the session, stop listeners, remove sensitive cache for that UID and prevent another account from opening it.</w:t>
       </w:r>
     </w:p>
     <w:p>
@@ -4976,7 +5580,7 @@
         <w:spacing w:after="80"/>
       </w:pPr>
       <w:r>
-        <w:t>Roll out to internal administrators, then staff, then remaining users. Monitor login success, role parity, denials and session revocation before expanding each cohort.</w:t>
+        <w:t>Canary administrators first, then staff, then remaining users. Expand only if success rate, p95 login time, route speed, Firestore reads and authorization-denial metrics meet baseline.</w:t>
       </w:r>
     </w:p>
     <w:tbl>
@@ -5120,6 +5724,18 @@
       </w:pPr>
       <w:r>
         <w:t>Logout clears the authenticated session and sensitive client caches.</w:t>
+      </w:r>
+    </w:p>
+    <w:p>
+      <w:pPr>
+        <w:spacing w:after="80"/>
+        <w:numPr>
+          <w:ilvl w:val="0"/>
+          <w:numId w:val="12"/>
+        </w:numPr>
+      </w:pPr>
+      <w:r>
+        <w:t>Warm authenticated restoration and common cached route rendering are at least as fast as the measured production baseline; Firestore reads per session do not increase.</w:t>
       </w:r>
     </w:p>
     <w:p>
@@ -7403,6 +8019,565 @@
         <w:pStyle w:val="Heading2"/>
       </w:pPr>
       <w:r>
+        <w:t>Secure in-app credential entry without Vercel environment editing</w:t>
+      </w:r>
+    </w:p>
+    <w:p>
+      <w:pPr>
+        <w:spacing w:after="100"/>
+      </w:pPr>
+      <w:r>
+        <w:rPr>
+          <w:b/>
+          <w:color w:val="1F4D78"/>
+        </w:rPr>
+        <w:t xml:space="preserve">Recommended architecture: </w:t>
+      </w:r>
+      <w:r>
+        <w:t>Move provider operations that require private credentials into Firebase Functions or Cloud Run. An authorized frontend settings page sends a new credential once to a protected Firebase function; the function writes Google Secret Manager using its runtime service identity and returns only metadata/status. Vercel never needs the provider key.</w:t>
+      </w:r>
+    </w:p>
+    <w:p>
+      <w:pPr>
+        <w:spacing w:after="100"/>
+      </w:pPr>
+      <w:r>
+        <w:rPr>
+          <w:b/>
+          <w:color w:val="1F4D78"/>
+        </w:rPr>
+        <w:t xml:space="preserve">Metadata model: </w:t>
+      </w:r>
+      <w:r>
+        <w:t>Firestore integration_configs/{provider} stores enabled, activeSecretVersion, last4, validationStatus, updatedAt, updatedBy and non-secret provider settings. integration_secret_audit stores append-only action metadata. The actual secret exists only as versions in Secret Manager.</w:t>
+      </w:r>
+    </w:p>
+    <w:p>
+      <w:pPr>
+        <w:spacing w:after="100"/>
+      </w:pPr>
+      <w:r>
+        <w:rPr>
+          <w:b/>
+          <w:color w:val="1F4D78"/>
+        </w:rPr>
+        <w:t xml:space="preserve">User interface: </w:t>
+      </w:r>
+      <w:r>
+        <w:t>Use masked inputs that are blank on every load, separate Save/Validate/Rotate/Disable actions, a fresh re-authentication prompt, visible last validation result, and explicit confirmation before changing a live provider. Never implement a reveal-current-secret button.</w:t>
+      </w:r>
+    </w:p>
+    <w:p>
+      <w:pPr>
+        <w:spacing w:after="100"/>
+      </w:pPr>
+      <w:r>
+        <w:rPr>
+          <w:b/>
+          <w:color w:val="1F4D78"/>
+        </w:rPr>
+        <w:t xml:space="preserve">Provider-call path: </w:t>
+      </w:r>
+      <w:r>
+        <w:t>The browser calls a permission-checked operation such as sendSms. The function reads the active secret internally, calls the provider and returns a redacted result. This preserves the convenience of frontend administration without putting credentials in frontend code, browser storage or Vercel settings.</w:t>
+      </w:r>
+    </w:p>
+    <w:tbl>
+      <w:tblPr>
+        <w:tblStyle w:val="TableGrid"/>
+        <w:tblW w:type="dxa" w:w="9360"/>
+        <w:jc w:val="center"/>
+        <w:tblLayout w:type="fixed"/>
+        <w:tblLook w:firstColumn="1" w:firstRow="1" w:lastColumn="0" w:lastRow="0" w:noHBand="0" w:noVBand="1" w:val="04A0"/>
+        <w:tblInd w:w="120" w:type="dxa"/>
+      </w:tblPr>
+      <w:tblGrid>
+        <w:gridCol w:w="1512"/>
+        <w:gridCol w:w="5040"/>
+        <w:gridCol w:w="2808"/>
+      </w:tblGrid>
+      <w:tr>
+        <w:trPr>
+          <w:tblHeader w:val="true"/>
+        </w:trPr>
+        <w:tc>
+          <w:tcPr>
+            <w:tcW w:type="dxa" w:w="1512"/>
+            <w:tcMar>
+              <w:top w:w="80" w:type="dxa"/>
+              <w:start w:w="120" w:type="dxa"/>
+              <w:bottom w:w="80" w:type="dxa"/>
+              <w:end w:w="120" w:type="dxa"/>
+            </w:tcMar>
+            <w:vAlign w:val="center"/>
+            <w:shd w:fill="E8EEF5"/>
+          </w:tcPr>
+          <w:p>
+            <w:pPr>
+              <w:spacing w:before="0" w:after="40" w:line="252" w:lineRule="auto"/>
+            </w:pPr>
+            <w:r>
+              <w:rPr>
+                <w:rFonts w:ascii="Calibri" w:hAnsi="Calibri"/>
+                <w:b/>
+                <w:color w:val="17365D"/>
+                <w:sz w:val="15"/>
+              </w:rPr>
+              <w:t>Control</w:t>
+            </w:r>
+          </w:p>
+        </w:tc>
+        <w:tc>
+          <w:tcPr>
+            <w:tcW w:type="dxa" w:w="5040"/>
+            <w:tcMar>
+              <w:top w:w="80" w:type="dxa"/>
+              <w:start w:w="120" w:type="dxa"/>
+              <w:bottom w:w="80" w:type="dxa"/>
+              <w:end w:w="120" w:type="dxa"/>
+            </w:tcMar>
+            <w:vAlign w:val="center"/>
+            <w:shd w:fill="E8EEF5"/>
+          </w:tcPr>
+          <w:p>
+            <w:pPr>
+              <w:spacing w:before="0" w:after="40" w:line="252" w:lineRule="auto"/>
+            </w:pPr>
+            <w:r>
+              <w:rPr>
+                <w:rFonts w:ascii="Calibri" w:hAnsi="Calibri"/>
+                <w:b/>
+                <w:color w:val="17365D"/>
+                <w:sz w:val="15"/>
+              </w:rPr>
+              <w:t>Exact behavior</w:t>
+            </w:r>
+          </w:p>
+        </w:tc>
+        <w:tc>
+          <w:tcPr>
+            <w:tcW w:type="dxa" w:w="2808"/>
+            <w:tcMar>
+              <w:top w:w="80" w:type="dxa"/>
+              <w:start w:w="120" w:type="dxa"/>
+              <w:bottom w:w="80" w:type="dxa"/>
+              <w:end w:w="120" w:type="dxa"/>
+            </w:tcMar>
+            <w:vAlign w:val="center"/>
+            <w:shd w:fill="E8EEF5"/>
+          </w:tcPr>
+          <w:p>
+            <w:pPr>
+              <w:spacing w:before="0" w:after="40" w:line="252" w:lineRule="auto"/>
+            </w:pPr>
+            <w:r>
+              <w:rPr>
+                <w:rFonts w:ascii="Calibri" w:hAnsi="Calibri"/>
+                <w:b/>
+                <w:color w:val="17365D"/>
+                <w:sz w:val="15"/>
+              </w:rPr>
+              <w:t>Failure/rollback behavior</w:t>
+            </w:r>
+          </w:p>
+        </w:tc>
+      </w:tr>
+      <w:tr>
+        <w:tc>
+          <w:tcPr>
+            <w:tcW w:type="dxa" w:w="1512"/>
+            <w:tcMar>
+              <w:top w:w="80" w:type="dxa"/>
+              <w:start w:w="120" w:type="dxa"/>
+              <w:bottom w:w="80" w:type="dxa"/>
+              <w:end w:w="120" w:type="dxa"/>
+            </w:tcMar>
+            <w:vAlign w:val="center"/>
+          </w:tcPr>
+          <w:p>
+            <w:pPr>
+              <w:spacing w:before="0" w:after="40" w:line="252" w:lineRule="auto"/>
+            </w:pPr>
+            <w:r>
+              <w:rPr>
+                <w:rFonts w:ascii="Calibri" w:hAnsi="Calibri"/>
+                <w:b w:val="0"/>
+                <w:sz w:val="15"/>
+              </w:rPr>
+              <w:t>Save</w:t>
+            </w:r>
+          </w:p>
+        </w:tc>
+        <w:tc>
+          <w:tcPr>
+            <w:tcW w:type="dxa" w:w="5040"/>
+            <w:tcMar>
+              <w:top w:w="80" w:type="dxa"/>
+              <w:start w:w="120" w:type="dxa"/>
+              <w:bottom w:w="80" w:type="dxa"/>
+              <w:end w:w="120" w:type="dxa"/>
+            </w:tcMar>
+            <w:vAlign w:val="center"/>
+          </w:tcPr>
+          <w:p>
+            <w:pPr>
+              <w:spacing w:before="0" w:after="40" w:line="252" w:lineRule="auto"/>
+            </w:pPr>
+            <w:r>
+              <w:rPr>
+                <w:rFonts w:ascii="Calibri" w:hAnsi="Calibri"/>
+                <w:b w:val="0"/>
+                <w:sz w:val="15"/>
+              </w:rPr>
+              <w:t>Fresh admin auth + integration.manage + App Check/rate limit; create a new Secret Manager version; no request-body logging.</w:t>
+            </w:r>
+          </w:p>
+        </w:tc>
+        <w:tc>
+          <w:tcPr>
+            <w:tcW w:type="dxa" w:w="2808"/>
+            <w:tcMar>
+              <w:top w:w="80" w:type="dxa"/>
+              <w:start w:w="120" w:type="dxa"/>
+              <w:bottom w:w="80" w:type="dxa"/>
+              <w:end w:w="120" w:type="dxa"/>
+            </w:tcMar>
+            <w:vAlign w:val="center"/>
+          </w:tcPr>
+          <w:p>
+            <w:pPr>
+              <w:spacing w:before="0" w:after="40" w:line="252" w:lineRule="auto"/>
+            </w:pPr>
+            <w:r>
+              <w:rPr>
+                <w:rFonts w:ascii="Calibri" w:hAnsi="Calibri"/>
+                <w:b w:val="0"/>
+                <w:sz w:val="15"/>
+              </w:rPr>
+              <w:t>If storage fails, keep the previous active version and show a generic failure with request ID.</w:t>
+            </w:r>
+          </w:p>
+        </w:tc>
+      </w:tr>
+      <w:tr>
+        <w:tc>
+          <w:tcPr>
+            <w:tcW w:type="dxa" w:w="1512"/>
+            <w:tcMar>
+              <w:top w:w="80" w:type="dxa"/>
+              <w:start w:w="120" w:type="dxa"/>
+              <w:bottom w:w="80" w:type="dxa"/>
+              <w:end w:w="120" w:type="dxa"/>
+            </w:tcMar>
+            <w:vAlign w:val="center"/>
+          </w:tcPr>
+          <w:p>
+            <w:pPr>
+              <w:spacing w:before="0" w:after="40" w:line="252" w:lineRule="auto"/>
+            </w:pPr>
+            <w:r>
+              <w:rPr>
+                <w:rFonts w:ascii="Calibri" w:hAnsi="Calibri"/>
+                <w:b w:val="0"/>
+                <w:sz w:val="15"/>
+              </w:rPr>
+              <w:t>Validate</w:t>
+            </w:r>
+          </w:p>
+        </w:tc>
+        <w:tc>
+          <w:tcPr>
+            <w:tcW w:type="dxa" w:w="5040"/>
+            <w:tcMar>
+              <w:top w:w="80" w:type="dxa"/>
+              <w:start w:w="120" w:type="dxa"/>
+              <w:bottom w:w="80" w:type="dxa"/>
+              <w:end w:w="120" w:type="dxa"/>
+            </w:tcMar>
+            <w:vAlign w:val="center"/>
+          </w:tcPr>
+          <w:p>
+            <w:pPr>
+              <w:spacing w:before="0" w:after="40" w:line="252" w:lineRule="auto"/>
+            </w:pPr>
+            <w:r>
+              <w:rPr>
+                <w:rFonts w:ascii="Calibri" w:hAnsi="Calibri"/>
+                <w:b w:val="0"/>
+                <w:sz w:val="15"/>
+              </w:rPr>
+              <w:t>Use a harmless provider balance/status call inside the function; store status and redacted provider account identity.</w:t>
+            </w:r>
+          </w:p>
+        </w:tc>
+        <w:tc>
+          <w:tcPr>
+            <w:tcW w:type="dxa" w:w="2808"/>
+            <w:tcMar>
+              <w:top w:w="80" w:type="dxa"/>
+              <w:start w:w="120" w:type="dxa"/>
+              <w:bottom w:w="80" w:type="dxa"/>
+              <w:end w:w="120" w:type="dxa"/>
+            </w:tcMar>
+            <w:vAlign w:val="center"/>
+          </w:tcPr>
+          <w:p>
+            <w:pPr>
+              <w:spacing w:before="0" w:after="40" w:line="252" w:lineRule="auto"/>
+            </w:pPr>
+            <w:r>
+              <w:rPr>
+                <w:rFonts w:ascii="Calibri" w:hAnsi="Calibri"/>
+                <w:b w:val="0"/>
+                <w:sz w:val="15"/>
+              </w:rPr>
+              <w:t>Do not activate a version that fails validation.</w:t>
+            </w:r>
+          </w:p>
+        </w:tc>
+      </w:tr>
+      <w:tr>
+        <w:tc>
+          <w:tcPr>
+            <w:tcW w:type="dxa" w:w="1512"/>
+            <w:tcMar>
+              <w:top w:w="80" w:type="dxa"/>
+              <w:start w:w="120" w:type="dxa"/>
+              <w:bottom w:w="80" w:type="dxa"/>
+              <w:end w:w="120" w:type="dxa"/>
+            </w:tcMar>
+            <w:vAlign w:val="center"/>
+          </w:tcPr>
+          <w:p>
+            <w:pPr>
+              <w:spacing w:before="0" w:after="40" w:line="252" w:lineRule="auto"/>
+            </w:pPr>
+            <w:r>
+              <w:rPr>
+                <w:rFonts w:ascii="Calibri" w:hAnsi="Calibri"/>
+                <w:b w:val="0"/>
+                <w:sz w:val="15"/>
+              </w:rPr>
+              <w:t>Activate</w:t>
+            </w:r>
+          </w:p>
+        </w:tc>
+        <w:tc>
+          <w:tcPr>
+            <w:tcW w:type="dxa" w:w="5040"/>
+            <w:tcMar>
+              <w:top w:w="80" w:type="dxa"/>
+              <w:start w:w="120" w:type="dxa"/>
+              <w:bottom w:w="80" w:type="dxa"/>
+              <w:end w:w="120" w:type="dxa"/>
+            </w:tcMar>
+            <w:vAlign w:val="center"/>
+          </w:tcPr>
+          <w:p>
+            <w:pPr>
+              <w:spacing w:before="0" w:after="40" w:line="252" w:lineRule="auto"/>
+            </w:pPr>
+            <w:r>
+              <w:rPr>
+                <w:rFonts w:ascii="Calibri" w:hAnsi="Calibri"/>
+                <w:b w:val="0"/>
+                <w:sz w:val="15"/>
+              </w:rPr>
+              <w:t>Transactionally update activeSecretVersion metadata after validation.</w:t>
+            </w:r>
+          </w:p>
+        </w:tc>
+        <w:tc>
+          <w:tcPr>
+            <w:tcW w:type="dxa" w:w="2808"/>
+            <w:tcMar>
+              <w:top w:w="80" w:type="dxa"/>
+              <w:start w:w="120" w:type="dxa"/>
+              <w:bottom w:w="80" w:type="dxa"/>
+              <w:end w:w="120" w:type="dxa"/>
+            </w:tcMar>
+            <w:vAlign w:val="center"/>
+          </w:tcPr>
+          <w:p>
+            <w:pPr>
+              <w:spacing w:before="0" w:after="40" w:line="252" w:lineRule="auto"/>
+            </w:pPr>
+            <w:r>
+              <w:rPr>
+                <w:rFonts w:ascii="Calibri" w:hAnsi="Calibri"/>
+                <w:b w:val="0"/>
+                <w:sz w:val="15"/>
+              </w:rPr>
+              <w:t>Previous version remains enabled for a short, audited rollback window.</w:t>
+            </w:r>
+          </w:p>
+        </w:tc>
+      </w:tr>
+      <w:tr>
+        <w:tc>
+          <w:tcPr>
+            <w:tcW w:type="dxa" w:w="1512"/>
+            <w:tcMar>
+              <w:top w:w="80" w:type="dxa"/>
+              <w:start w:w="120" w:type="dxa"/>
+              <w:bottom w:w="80" w:type="dxa"/>
+              <w:end w:w="120" w:type="dxa"/>
+            </w:tcMar>
+            <w:vAlign w:val="center"/>
+          </w:tcPr>
+          <w:p>
+            <w:pPr>
+              <w:spacing w:before="0" w:after="40" w:line="252" w:lineRule="auto"/>
+            </w:pPr>
+            <w:r>
+              <w:rPr>
+                <w:rFonts w:ascii="Calibri" w:hAnsi="Calibri"/>
+                <w:b w:val="0"/>
+                <w:sz w:val="15"/>
+              </w:rPr>
+              <w:t>Use</w:t>
+            </w:r>
+          </w:p>
+        </w:tc>
+        <w:tc>
+          <w:tcPr>
+            <w:tcW w:type="dxa" w:w="5040"/>
+            <w:tcMar>
+              <w:top w:w="80" w:type="dxa"/>
+              <w:start w:w="120" w:type="dxa"/>
+              <w:bottom w:w="80" w:type="dxa"/>
+              <w:end w:w="120" w:type="dxa"/>
+            </w:tcMar>
+            <w:vAlign w:val="center"/>
+          </w:tcPr>
+          <w:p>
+            <w:pPr>
+              <w:spacing w:before="0" w:after="40" w:line="252" w:lineRule="auto"/>
+            </w:pPr>
+            <w:r>
+              <w:rPr>
+                <w:rFonts w:ascii="Calibri" w:hAnsi="Calibri"/>
+                <w:b w:val="0"/>
+                <w:sz w:val="15"/>
+              </w:rPr>
+              <w:t>Server function reads active version and performs the provider action; browser receives no credential.</w:t>
+            </w:r>
+          </w:p>
+        </w:tc>
+        <w:tc>
+          <w:tcPr>
+            <w:tcW w:type="dxa" w:w="2808"/>
+            <w:tcMar>
+              <w:top w:w="80" w:type="dxa"/>
+              <w:start w:w="120" w:type="dxa"/>
+              <w:bottom w:w="80" w:type="dxa"/>
+              <w:end w:w="120" w:type="dxa"/>
+            </w:tcMar>
+            <w:vAlign w:val="center"/>
+          </w:tcPr>
+          <w:p>
+            <w:pPr>
+              <w:spacing w:before="0" w:after="40" w:line="252" w:lineRule="auto"/>
+            </w:pPr>
+            <w:r>
+              <w:rPr>
+                <w:rFonts w:ascii="Calibri" w:hAnsi="Calibri"/>
+                <w:b w:val="0"/>
+                <w:sz w:val="15"/>
+              </w:rPr>
+              <w:t>Circuit-break on provider errors; do not fall back to source or stale browser values.</w:t>
+            </w:r>
+          </w:p>
+        </w:tc>
+      </w:tr>
+      <w:tr>
+        <w:tc>
+          <w:tcPr>
+            <w:tcW w:type="dxa" w:w="1512"/>
+            <w:tcMar>
+              <w:top w:w="80" w:type="dxa"/>
+              <w:start w:w="120" w:type="dxa"/>
+              <w:bottom w:w="80" w:type="dxa"/>
+              <w:end w:w="120" w:type="dxa"/>
+            </w:tcMar>
+            <w:vAlign w:val="center"/>
+          </w:tcPr>
+          <w:p>
+            <w:pPr>
+              <w:spacing w:before="0" w:after="40" w:line="252" w:lineRule="auto"/>
+            </w:pPr>
+            <w:r>
+              <w:rPr>
+                <w:rFonts w:ascii="Calibri" w:hAnsi="Calibri"/>
+                <w:b w:val="0"/>
+                <w:sz w:val="15"/>
+              </w:rPr>
+              <w:t>Rotate/revoke</w:t>
+            </w:r>
+          </w:p>
+        </w:tc>
+        <w:tc>
+          <w:tcPr>
+            <w:tcW w:type="dxa" w:w="5040"/>
+            <w:tcMar>
+              <w:top w:w="80" w:type="dxa"/>
+              <w:start w:w="120" w:type="dxa"/>
+              <w:bottom w:w="80" w:type="dxa"/>
+              <w:end w:w="120" w:type="dxa"/>
+            </w:tcMar>
+            <w:vAlign w:val="center"/>
+          </w:tcPr>
+          <w:p>
+            <w:pPr>
+              <w:spacing w:before="0" w:after="40" w:line="252" w:lineRule="auto"/>
+            </w:pPr>
+            <w:r>
+              <w:rPr>
+                <w:rFonts w:ascii="Calibri" w:hAnsi="Calibri"/>
+                <w:b w:val="0"/>
+                <w:sz w:val="15"/>
+              </w:rPr>
+              <w:t>Create, validate, activate, observe, then disable the old version.</w:t>
+            </w:r>
+          </w:p>
+        </w:tc>
+        <w:tc>
+          <w:tcPr>
+            <w:tcW w:type="dxa" w:w="2808"/>
+            <w:tcMar>
+              <w:top w:w="80" w:type="dxa"/>
+              <w:start w:w="120" w:type="dxa"/>
+              <w:bottom w:w="80" w:type="dxa"/>
+              <w:end w:w="120" w:type="dxa"/>
+            </w:tcMar>
+            <w:vAlign w:val="center"/>
+          </w:tcPr>
+          <w:p>
+            <w:pPr>
+              <w:spacing w:before="0" w:after="40" w:line="252" w:lineRule="auto"/>
+            </w:pPr>
+            <w:r>
+              <w:rPr>
+                <w:rFonts w:ascii="Calibri" w:hAnsi="Calibri"/>
+                <w:b w:val="0"/>
+                <w:sz w:val="15"/>
+              </w:rPr>
+              <w:t>One-click audited rollback only during the approved window; otherwise create a new version.</w:t>
+            </w:r>
+          </w:p>
+        </w:tc>
+      </w:tr>
+    </w:tbl>
+    <w:p>
+      <w:pPr>
+        <w:spacing w:after="0"/>
+      </w:pPr>
+    </w:p>
+    <w:p>
+      <w:pPr>
+        <w:pStyle w:val="Heading2"/>
+      </w:pPr>
+      <w:r>
         <w:t>Implementation flow</w:t>
       </w:r>
     </w:p>
@@ -9187,7 +10362,7 @@
         <w:pStyle w:val="Heading1"/>
       </w:pPr>
       <w:r>
-        <w:t>Phase 9 — Reduce data exposure and performance risk</w:t>
+        <w:t>Phase 9 — Preserve or improve speed with a safe, read-efficient cache</w:t>
       </w:r>
     </w:p>
     <w:tbl>
@@ -9332,7 +10507,7 @@
         <w:t xml:space="preserve">Problem: </w:t>
       </w:r>
       <w:r>
-        <w:t>GlobalDataPreloader loads broad pupil, staff, user, access-level and other datasets for Admin/Staff users. The shared First Load JS is approximately 1.92 MB, including an approximately 1.65 MB vendor chunk. Firestore IndexedDB can persist sensitive data after logout.</w:t>
+        <w:t>GlobalDataPreloader and persistent Firestore cache were introduced to solve real latency and database-read problems. Removing them would regress the live product. The remaining issue is that some preloads are broader than the current screen/permission needs and cache partitions/freshness rules are not explicit enough for sensitive school data.</w:t>
       </w:r>
     </w:p>
     <w:p>
@@ -9347,8 +10522,584 @@
         <w:t xml:space="preserve">Risk: </w:t>
       </w:r>
       <w:r>
-        <w:t>Users download more personal data than their immediate task requires; compromised or shared devices retain cached school data; startup is slow and memory-heavy, especially on mobile or low-bandwidth connections.</w:t>
+        <w:t>A blanket cache removal causes slower screens, more Firestore reads and poor behavior on slow connections. Leaving cache unscoped can expose another account's data on shared devices, preserve stale permissions, or download records a role does not need. The countermeasure must improve both safety and performance.</w:t>
       </w:r>
+    </w:p>
+    <w:p>
+      <w:pPr>
+        <w:pStyle w:val="Heading2"/>
+      </w:pPr>
+      <w:r>
+        <w:t>Cache policy by data class</w:t>
+      </w:r>
+    </w:p>
+    <w:tbl>
+      <w:tblPr>
+        <w:tblStyle w:val="TableGrid"/>
+        <w:tblW w:type="dxa" w:w="9360"/>
+        <w:jc w:val="center"/>
+        <w:tblLayout w:type="fixed"/>
+        <w:tblLook w:firstColumn="1" w:firstRow="1" w:lastColumn="0" w:lastRow="0" w:noHBand="0" w:noVBand="1" w:val="04A0"/>
+        <w:tblInd w:w="120" w:type="dxa"/>
+      </w:tblPr>
+      <w:tblGrid>
+        <w:gridCol w:w="2088"/>
+        <w:gridCol w:w="4320"/>
+        <w:gridCol w:w="2952"/>
+      </w:tblGrid>
+      <w:tr>
+        <w:trPr>
+          <w:tblHeader w:val="true"/>
+        </w:trPr>
+        <w:tc>
+          <w:tcPr>
+            <w:tcW w:type="dxa" w:w="2088"/>
+            <w:tcMar>
+              <w:top w:w="80" w:type="dxa"/>
+              <w:start w:w="120" w:type="dxa"/>
+              <w:bottom w:w="80" w:type="dxa"/>
+              <w:end w:w="120" w:type="dxa"/>
+            </w:tcMar>
+            <w:vAlign w:val="center"/>
+            <w:shd w:fill="E8EEF5"/>
+          </w:tcPr>
+          <w:p>
+            <w:pPr>
+              <w:spacing w:before="0" w:after="40" w:line="252" w:lineRule="auto"/>
+            </w:pPr>
+            <w:r>
+              <w:rPr>
+                <w:rFonts w:ascii="Calibri" w:hAnsi="Calibri"/>
+                <w:b/>
+                <w:color w:val="17365D"/>
+                <w:sz w:val="15"/>
+              </w:rPr>
+              <w:t>Data class</w:t>
+            </w:r>
+          </w:p>
+        </w:tc>
+        <w:tc>
+          <w:tcPr>
+            <w:tcW w:type="dxa" w:w="4320"/>
+            <w:tcMar>
+              <w:top w:w="80" w:type="dxa"/>
+              <w:start w:w="120" w:type="dxa"/>
+              <w:bottom w:w="80" w:type="dxa"/>
+              <w:end w:w="120" w:type="dxa"/>
+            </w:tcMar>
+            <w:vAlign w:val="center"/>
+            <w:shd w:fill="E8EEF5"/>
+          </w:tcPr>
+          <w:p>
+            <w:pPr>
+              <w:spacing w:before="0" w:after="40" w:line="252" w:lineRule="auto"/>
+            </w:pPr>
+            <w:r>
+              <w:rPr>
+                <w:rFonts w:ascii="Calibri" w:hAnsi="Calibri"/>
+                <w:b/>
+                <w:color w:val="17365D"/>
+                <w:sz w:val="15"/>
+              </w:rPr>
+              <w:t>Recommended cache behavior</w:t>
+            </w:r>
+          </w:p>
+        </w:tc>
+        <w:tc>
+          <w:tcPr>
+            <w:tcW w:type="dxa" w:w="2952"/>
+            <w:tcMar>
+              <w:top w:w="80" w:type="dxa"/>
+              <w:start w:w="120" w:type="dxa"/>
+              <w:bottom w:w="80" w:type="dxa"/>
+              <w:end w:w="120" w:type="dxa"/>
+            </w:tcMar>
+            <w:vAlign w:val="center"/>
+            <w:shd w:fill="E8EEF5"/>
+          </w:tcPr>
+          <w:p>
+            <w:pPr>
+              <w:spacing w:before="0" w:after="40" w:line="252" w:lineRule="auto"/>
+            </w:pPr>
+            <w:r>
+              <w:rPr>
+                <w:rFonts w:ascii="Calibri" w:hAnsi="Calibri"/>
+                <w:b/>
+                <w:color w:val="17365D"/>
+                <w:sz w:val="15"/>
+              </w:rPr>
+              <w:t>Freshness/invalidation</w:t>
+            </w:r>
+          </w:p>
+        </w:tc>
+      </w:tr>
+      <w:tr>
+        <w:tc>
+          <w:tcPr>
+            <w:tcW w:type="dxa" w:w="2088"/>
+            <w:tcMar>
+              <w:top w:w="80" w:type="dxa"/>
+              <w:start w:w="120" w:type="dxa"/>
+              <w:bottom w:w="80" w:type="dxa"/>
+              <w:end w:w="120" w:type="dxa"/>
+            </w:tcMar>
+            <w:vAlign w:val="center"/>
+          </w:tcPr>
+          <w:p>
+            <w:pPr>
+              <w:spacing w:before="0" w:after="40" w:line="252" w:lineRule="auto"/>
+            </w:pPr>
+            <w:r>
+              <w:rPr>
+                <w:rFonts w:ascii="Calibri" w:hAnsi="Calibri"/>
+                <w:b w:val="0"/>
+                <w:sz w:val="15"/>
+              </w:rPr>
+              <w:t>Static/public assets and non-sensitive reference values</w:t>
+            </w:r>
+          </w:p>
+        </w:tc>
+        <w:tc>
+          <w:tcPr>
+            <w:tcW w:type="dxa" w:w="4320"/>
+            <w:tcMar>
+              <w:top w:w="80" w:type="dxa"/>
+              <w:start w:w="120" w:type="dxa"/>
+              <w:bottom w:w="80" w:type="dxa"/>
+              <w:end w:w="120" w:type="dxa"/>
+            </w:tcMar>
+            <w:vAlign w:val="center"/>
+          </w:tcPr>
+          <w:p>
+            <w:pPr>
+              <w:spacing w:before="0" w:after="40" w:line="252" w:lineRule="auto"/>
+            </w:pPr>
+            <w:r>
+              <w:rPr>
+                <w:rFonts w:ascii="Calibri" w:hAnsi="Calibri"/>
+                <w:b w:val="0"/>
+                <w:sz w:val="15"/>
+              </w:rPr>
+              <w:t>Persistent cache; prefetch; share across logged-out/logged-in states when no school-private data is present.</w:t>
+            </w:r>
+          </w:p>
+        </w:tc>
+        <w:tc>
+          <w:tcPr>
+            <w:tcW w:type="dxa" w:w="2952"/>
+            <w:tcMar>
+              <w:top w:w="80" w:type="dxa"/>
+              <w:start w:w="120" w:type="dxa"/>
+              <w:bottom w:w="80" w:type="dxa"/>
+              <w:end w:w="120" w:type="dxa"/>
+            </w:tcMar>
+            <w:vAlign w:val="center"/>
+          </w:tcPr>
+          <w:p>
+            <w:pPr>
+              <w:spacing w:before="0" w:after="40" w:line="252" w:lineRule="auto"/>
+            </w:pPr>
+            <w:r>
+              <w:rPr>
+                <w:rFonts w:ascii="Calibri" w:hAnsi="Calibri"/>
+                <w:b w:val="0"/>
+                <w:sz w:val="15"/>
+              </w:rPr>
+              <w:t>Version with deployment/schema; 6-24 hour stale time or explicit version change.</w:t>
+            </w:r>
+          </w:p>
+        </w:tc>
+      </w:tr>
+      <w:tr>
+        <w:tc>
+          <w:tcPr>
+            <w:tcW w:type="dxa" w:w="2088"/>
+            <w:tcMar>
+              <w:top w:w="80" w:type="dxa"/>
+              <w:start w:w="120" w:type="dxa"/>
+              <w:bottom w:w="80" w:type="dxa"/>
+              <w:end w:w="120" w:type="dxa"/>
+            </w:tcMar>
+            <w:vAlign w:val="center"/>
+          </w:tcPr>
+          <w:p>
+            <w:pPr>
+              <w:spacing w:before="0" w:after="40" w:line="252" w:lineRule="auto"/>
+            </w:pPr>
+            <w:r>
+              <w:rPr>
+                <w:rFonts w:ascii="Calibri" w:hAnsi="Calibri"/>
+                <w:b w:val="0"/>
+                <w:sz w:val="15"/>
+              </w:rPr>
+              <w:t>Role-scoped lists and summaries</w:t>
+            </w:r>
+          </w:p>
+        </w:tc>
+        <w:tc>
+          <w:tcPr>
+            <w:tcW w:type="dxa" w:w="4320"/>
+            <w:tcMar>
+              <w:top w:w="80" w:type="dxa"/>
+              <w:start w:w="120" w:type="dxa"/>
+              <w:bottom w:w="80" w:type="dxa"/>
+              <w:end w:w="120" w:type="dxa"/>
+            </w:tcMar>
+            <w:vAlign w:val="center"/>
+          </w:tcPr>
+          <w:p>
+            <w:pPr>
+              <w:spacing w:before="0" w:after="40" w:line="252" w:lineRule="auto"/>
+            </w:pPr>
+            <w:r>
+              <w:rPr>
+                <w:rFonts w:ascii="Calibri" w:hAnsi="Calibri"/>
+                <w:b w:val="0"/>
+                <w:sz w:val="15"/>
+              </w:rPr>
+              <w:t>Persistent UID/school/role partition; stale-while-revalidate; paginate and prefetch likely next screens.</w:t>
+            </w:r>
+          </w:p>
+        </w:tc>
+        <w:tc>
+          <w:tcPr>
+            <w:tcW w:type="dxa" w:w="2952"/>
+            <w:tcMar>
+              <w:top w:w="80" w:type="dxa"/>
+              <w:start w:w="120" w:type="dxa"/>
+              <w:bottom w:w="80" w:type="dxa"/>
+              <w:end w:w="120" w:type="dxa"/>
+            </w:tcMar>
+            <w:vAlign w:val="center"/>
+          </w:tcPr>
+          <w:p>
+            <w:pPr>
+              <w:spacing w:before="0" w:after="40" w:line="252" w:lineRule="auto"/>
+            </w:pPr>
+            <w:r>
+              <w:rPr>
+                <w:rFonts w:ascii="Calibri" w:hAnsi="Calibri"/>
+                <w:b w:val="0"/>
+                <w:sz w:val="15"/>
+              </w:rPr>
+              <w:t>5-15 minute stale time; changedAt cursor or cache-version document; invalidate on successful writes.</w:t>
+            </w:r>
+          </w:p>
+        </w:tc>
+      </w:tr>
+      <w:tr>
+        <w:tc>
+          <w:tcPr>
+            <w:tcW w:type="dxa" w:w="2088"/>
+            <w:tcMar>
+              <w:top w:w="80" w:type="dxa"/>
+              <w:start w:w="120" w:type="dxa"/>
+              <w:bottom w:w="80" w:type="dxa"/>
+              <w:end w:w="120" w:type="dxa"/>
+            </w:tcMar>
+            <w:vAlign w:val="center"/>
+          </w:tcPr>
+          <w:p>
+            <w:pPr>
+              <w:spacing w:before="0" w:after="40" w:line="252" w:lineRule="auto"/>
+            </w:pPr>
+            <w:r>
+              <w:rPr>
+                <w:rFonts w:ascii="Calibri" w:hAnsi="Calibri"/>
+                <w:b w:val="0"/>
+                <w:sz w:val="15"/>
+              </w:rPr>
+              <w:t>Pupil/staff detail and attendance</w:t>
+            </w:r>
+          </w:p>
+        </w:tc>
+        <w:tc>
+          <w:tcPr>
+            <w:tcW w:type="dxa" w:w="4320"/>
+            <w:tcMar>
+              <w:top w:w="80" w:type="dxa"/>
+              <w:start w:w="120" w:type="dxa"/>
+              <w:bottom w:w="80" w:type="dxa"/>
+              <w:end w:w="120" w:type="dxa"/>
+            </w:tcMar>
+            <w:vAlign w:val="center"/>
+          </w:tcPr>
+          <w:p>
+            <w:pPr>
+              <w:spacing w:before="0" w:after="40" w:line="252" w:lineRule="auto"/>
+            </w:pPr>
+            <w:r>
+              <w:rPr>
+                <w:rFonts w:ascii="Calibri" w:hAnsi="Calibri"/>
+                <w:b w:val="0"/>
+                <w:sz w:val="15"/>
+              </w:rPr>
+              <w:t>Cache only records the verified role can access; keep last-known view for slow links; no cross-user partition reuse.</w:t>
+            </w:r>
+          </w:p>
+        </w:tc>
+        <w:tc>
+          <w:tcPr>
+            <w:tcW w:type="dxa" w:w="2952"/>
+            <w:tcMar>
+              <w:top w:w="80" w:type="dxa"/>
+              <w:start w:w="120" w:type="dxa"/>
+              <w:bottom w:w="80" w:type="dxa"/>
+              <w:end w:w="120" w:type="dxa"/>
+            </w:tcMar>
+            <w:vAlign w:val="center"/>
+          </w:tcPr>
+          <w:p>
+            <w:pPr>
+              <w:spacing w:before="0" w:after="40" w:line="252" w:lineRule="auto"/>
+            </w:pPr>
+            <w:r>
+              <w:rPr>
+                <w:rFonts w:ascii="Calibri" w:hAnsi="Calibri"/>
+                <w:b w:val="0"/>
+                <w:sz w:val="15"/>
+              </w:rPr>
+              <w:t>Short stale time or screen-scoped listener; invalidate affected record/class, not the whole database.</w:t>
+            </w:r>
+          </w:p>
+        </w:tc>
+      </w:tr>
+      <w:tr>
+        <w:tc>
+          <w:tcPr>
+            <w:tcW w:type="dxa" w:w="2088"/>
+            <w:tcMar>
+              <w:top w:w="80" w:type="dxa"/>
+              <w:start w:w="120" w:type="dxa"/>
+              <w:bottom w:w="80" w:type="dxa"/>
+              <w:end w:w="120" w:type="dxa"/>
+            </w:tcMar>
+            <w:vAlign w:val="center"/>
+          </w:tcPr>
+          <w:p>
+            <w:pPr>
+              <w:spacing w:before="0" w:after="40" w:line="252" w:lineRule="auto"/>
+            </w:pPr>
+            <w:r>
+              <w:rPr>
+                <w:rFonts w:ascii="Calibri" w:hAnsi="Calibri"/>
+                <w:b w:val="0"/>
+                <w:sz w:val="15"/>
+              </w:rPr>
+              <w:t>Fees, payments and provider status</w:t>
+            </w:r>
+          </w:p>
+        </w:tc>
+        <w:tc>
+          <w:tcPr>
+            <w:tcW w:type="dxa" w:w="4320"/>
+            <w:tcMar>
+              <w:top w:w="80" w:type="dxa"/>
+              <w:start w:w="120" w:type="dxa"/>
+              <w:bottom w:w="80" w:type="dxa"/>
+              <w:end w:w="120" w:type="dxa"/>
+            </w:tcMar>
+            <w:vAlign w:val="center"/>
+          </w:tcPr>
+          <w:p>
+            <w:pPr>
+              <w:spacing w:before="0" w:after="40" w:line="252" w:lineRule="auto"/>
+            </w:pPr>
+            <w:r>
+              <w:rPr>
+                <w:rFonts w:ascii="Calibri" w:hAnsi="Calibri"/>
+                <w:b w:val="0"/>
+                <w:sz w:val="15"/>
+              </w:rPr>
+              <w:t>Display cached summary immediately with a visible freshness label; server-confirm every critical mutation and reconciliation.</w:t>
+            </w:r>
+          </w:p>
+        </w:tc>
+        <w:tc>
+          <w:tcPr>
+            <w:tcW w:type="dxa" w:w="2952"/>
+            <w:tcMar>
+              <w:top w:w="80" w:type="dxa"/>
+              <w:start w:w="120" w:type="dxa"/>
+              <w:bottom w:w="80" w:type="dxa"/>
+              <w:end w:w="120" w:type="dxa"/>
+            </w:tcMar>
+            <w:vAlign w:val="center"/>
+          </w:tcPr>
+          <w:p>
+            <w:pPr>
+              <w:spacing w:before="0" w:after="40" w:line="252" w:lineRule="auto"/>
+            </w:pPr>
+            <w:r>
+              <w:rPr>
+                <w:rFonts w:ascii="Calibri" w:hAnsi="Calibri"/>
+                <w:b w:val="0"/>
+                <w:sz w:val="15"/>
+              </w:rPr>
+              <w:t>30-60 second revalidation or event-driven invalidation; never convert fetch failure into sample data.</w:t>
+            </w:r>
+          </w:p>
+        </w:tc>
+      </w:tr>
+      <w:tr>
+        <w:tc>
+          <w:tcPr>
+            <w:tcW w:type="dxa" w:w="2088"/>
+            <w:tcMar>
+              <w:top w:w="80" w:type="dxa"/>
+              <w:start w:w="120" w:type="dxa"/>
+              <w:bottom w:w="80" w:type="dxa"/>
+              <w:end w:w="120" w:type="dxa"/>
+            </w:tcMar>
+            <w:vAlign w:val="center"/>
+          </w:tcPr>
+          <w:p>
+            <w:pPr>
+              <w:spacing w:before="0" w:after="40" w:line="252" w:lineRule="auto"/>
+            </w:pPr>
+            <w:r>
+              <w:rPr>
+                <w:rFonts w:ascii="Calibri" w:hAnsi="Calibri"/>
+                <w:b w:val="0"/>
+                <w:sz w:val="15"/>
+              </w:rPr>
+              <w:t>Identity, role and permissions</w:t>
+            </w:r>
+          </w:p>
+        </w:tc>
+        <w:tc>
+          <w:tcPr>
+            <w:tcW w:type="dxa" w:w="4320"/>
+            <w:tcMar>
+              <w:top w:w="80" w:type="dxa"/>
+              <w:start w:w="120" w:type="dxa"/>
+              <w:bottom w:w="80" w:type="dxa"/>
+              <w:end w:w="120" w:type="dxa"/>
+            </w:tcMar>
+            <w:vAlign w:val="center"/>
+          </w:tcPr>
+          <w:p>
+            <w:pPr>
+              <w:spacing w:before="0" w:after="40" w:line="252" w:lineRule="auto"/>
+            </w:pPr>
+            <w:r>
+              <w:rPr>
+                <w:rFonts w:ascii="Calibri" w:hAnsi="Calibri"/>
+                <w:b w:val="0"/>
+                <w:sz w:val="15"/>
+              </w:rPr>
+              <w:t>Firebase session/token persistence plus cached display profile; cache may shape UI but cannot grant access.</w:t>
+            </w:r>
+          </w:p>
+        </w:tc>
+        <w:tc>
+          <w:tcPr>
+            <w:tcW w:type="dxa" w:w="2952"/>
+            <w:tcMar>
+              <w:top w:w="80" w:type="dxa"/>
+              <w:start w:w="120" w:type="dxa"/>
+              <w:bottom w:w="80" w:type="dxa"/>
+              <w:end w:w="120" w:type="dxa"/>
+            </w:tcMar>
+            <w:vAlign w:val="center"/>
+          </w:tcPr>
+          <w:p>
+            <w:pPr>
+              <w:spacing w:before="0" w:after="40" w:line="252" w:lineRule="auto"/>
+            </w:pPr>
+            <w:r>
+              <w:rPr>
+                <w:rFonts w:ascii="Calibri" w:hAnsi="Calibri"/>
+                <w:b w:val="0"/>
+                <w:sz w:val="15"/>
+              </w:rPr>
+              <w:t>Token refresh/revocation and permissionVersion change; fail protected action closed.</w:t>
+            </w:r>
+          </w:p>
+        </w:tc>
+      </w:tr>
+      <w:tr>
+        <w:tc>
+          <w:tcPr>
+            <w:tcW w:type="dxa" w:w="2088"/>
+            <w:tcMar>
+              <w:top w:w="80" w:type="dxa"/>
+              <w:start w:w="120" w:type="dxa"/>
+              <w:bottom w:w="80" w:type="dxa"/>
+              <w:end w:w="120" w:type="dxa"/>
+            </w:tcMar>
+            <w:vAlign w:val="center"/>
+          </w:tcPr>
+          <w:p>
+            <w:pPr>
+              <w:spacing w:before="0" w:after="40" w:line="252" w:lineRule="auto"/>
+            </w:pPr>
+            <w:r>
+              <w:rPr>
+                <w:rFonts w:ascii="Calibri" w:hAnsi="Calibri"/>
+                <w:b w:val="0"/>
+                <w:sz w:val="15"/>
+              </w:rPr>
+              <w:t>Secrets/password material</w:t>
+            </w:r>
+          </w:p>
+        </w:tc>
+        <w:tc>
+          <w:tcPr>
+            <w:tcW w:type="dxa" w:w="4320"/>
+            <w:tcMar>
+              <w:top w:w="80" w:type="dxa"/>
+              <w:start w:w="120" w:type="dxa"/>
+              <w:bottom w:w="80" w:type="dxa"/>
+              <w:end w:w="120" w:type="dxa"/>
+            </w:tcMar>
+            <w:vAlign w:val="center"/>
+          </w:tcPr>
+          <w:p>
+            <w:pPr>
+              <w:spacing w:before="0" w:after="40" w:line="252" w:lineRule="auto"/>
+            </w:pPr>
+            <w:r>
+              <w:rPr>
+                <w:rFonts w:ascii="Calibri" w:hAnsi="Calibri"/>
+                <w:b w:val="0"/>
+                <w:sz w:val="15"/>
+              </w:rPr>
+              <w:t>Never cache in browser, service worker, Firestore-readable documents or logs.</w:t>
+            </w:r>
+          </w:p>
+        </w:tc>
+        <w:tc>
+          <w:tcPr>
+            <w:tcW w:type="dxa" w:w="2952"/>
+            <w:tcMar>
+              <w:top w:w="80" w:type="dxa"/>
+              <w:start w:w="120" w:type="dxa"/>
+              <w:bottom w:w="80" w:type="dxa"/>
+              <w:end w:w="120" w:type="dxa"/>
+            </w:tcMar>
+            <w:vAlign w:val="center"/>
+          </w:tcPr>
+          <w:p>
+            <w:pPr>
+              <w:spacing w:before="0" w:after="40" w:line="252" w:lineRule="auto"/>
+            </w:pPr>
+            <w:r>
+              <w:rPr>
+                <w:rFonts w:ascii="Calibri" w:hAnsi="Calibri"/>
+                <w:b w:val="0"/>
+                <w:sz w:val="15"/>
+              </w:rPr>
+              <w:t>Server-only Secret Manager; rotate/revoke through audited function.</w:t>
+            </w:r>
+          </w:p>
+        </w:tc>
+      </w:tr>
+    </w:tbl>
+    <w:p>
+      <w:pPr>
+        <w:spacing w:after="0"/>
+      </w:pPr>
     </w:p>
     <w:p>
       <w:pPr>
@@ -9367,7 +11118,7 @@
         <w:spacing w:after="80"/>
       </w:pPr>
       <w:r>
-        <w:t>Instrument route load time, query count, document count, transferred bytes and cache hit rate before changing behavior. Set budgets per critical route.</w:t>
+        <w:t>Instrument the current live baseline: warm/cold route time, p95 login/session restore, query/listener count, documents read, writes, transferred bytes, cache hit rate, stale-data incidents and device memory. No cache change merges without before/after evidence.</w:t>
       </w:r>
     </w:p>
     <w:p>
@@ -9379,7 +11130,7 @@
         <w:spacing w:after="80"/>
       </w:pPr>
       <w:r>
-        <w:t>Replace role-wide global preloads with permission-aware and route-aware query manifests. Fetch only fields and records needed for the current screen; paginate large lists.</w:t>
+        <w:t>Keep stale-while-revalidate as the default screen pattern: render cached data immediately, revalidate only expired/changed queries, deduplicate concurrent fetches and cancel listeners when a screen no longer needs them.</w:t>
       </w:r>
     </w:p>
     <w:p>
@@ -9391,7 +11142,7 @@
         <w:spacing w:after="80"/>
       </w:pPr>
       <w:r>
-        <w:t>Keep existing hook/query keys stable while changing the loader behind them so active components do not all need simultaneous edits.</w:t>
+        <w:t>Replace role-wide all-data preloads with a permission-aware preload manifest. Preserve existing query keys and hook contracts so components keep their speed while the loader fetches fewer, better-scoped documents.</w:t>
       </w:r>
     </w:p>
     <w:p>
@@ -9403,7 +11154,7 @@
         <w:spacing w:after="80"/>
       </w:pPr>
       <w:r>
-        <w:t>Dynamically import report/PDF/chart/editor modules only on screens that use them. Confirm server/client boundaries and avoid loading multiple competing UI/router stacks.</w:t>
+        <w:t>Create denormalized read models/summary documents for expensive dashboards and list rows. Update them transactionally/server-side so one summary read replaces many document reads without losing correctness.</w:t>
       </w:r>
     </w:p>
     <w:p>
@@ -9415,7 +11166,7 @@
         <w:spacing w:after="80"/>
       </w:pPr>
       <w:r>
-        <w:t>Define device privacy policy: session-only persistence for sensitive roles or explicit trusted-device choice, bounded cache lifetime, and a tested logout cache-clearing path.</w:t>
+        <w:t>Use granular invalidation after writes, changedAt cursors, schema/cache versions and multi-tab broadcast. Avoid full-cache clears or full-collection refetches when one pupil, payment or setting changes.</w:t>
       </w:r>
     </w:p>
     <w:p>
@@ -9427,8 +11178,531 @@
         <w:spacing w:after="80"/>
       </w:pPr>
       <w:r>
-        <w:t>Split very large components only after characterization tests exist. Extract domain logic first, then presentation; do not combine with visual redesign.</w:t>
+        <w:t>Partition IndexedDB/query caches by project, school, Firebase UID, role/permissionVersion and schema version. On logout/account switch remove sensitive partitions and close listeners; optionally retain only public/reference data.</w:t>
       </w:r>
+    </w:p>
+    <w:p>
+      <w:pPr>
+        <w:spacing w:after="80"/>
+        <w:numPr>
+          <w:ilvl w:val="0"/>
+          <w:numId w:val="10"/>
+        </w:numPr>
+      </w:pPr>
+      <w:r>
+        <w:t>Coalesce/debounce non-critical autosaves, batch compatible writes and use an offline outbox with idempotency for safe forms. Payments, permissions and other high-risk writes must be server-confirmed and never blindly replayed.</w:t>
+      </w:r>
+    </w:p>
+    <w:p>
+      <w:pPr>
+        <w:spacing w:after="80"/>
+        <w:numPr>
+          <w:ilvl w:val="0"/>
+          <w:numId w:val="10"/>
+        </w:numPr>
+      </w:pPr>
+      <w:r>
+        <w:t>Dynamically import large PDF/report/chart/editor modules and paginate large lists. Split oversized components only after characterization tests, without combining this work with a UI redesign.</w:t>
+      </w:r>
+    </w:p>
+    <w:p>
+      <w:pPr>
+        <w:pStyle w:val="Heading2"/>
+      </w:pPr>
+      <w:r>
+        <w:t>Suggested non-regression budgets (confirm against measured production baseline)</w:t>
+      </w:r>
+    </w:p>
+    <w:tbl>
+      <w:tblPr>
+        <w:tblStyle w:val="TableGrid"/>
+        <w:tblW w:type="dxa" w:w="9360"/>
+        <w:jc w:val="center"/>
+        <w:tblLayout w:type="fixed"/>
+        <w:tblLook w:firstColumn="1" w:firstRow="1" w:lastColumn="0" w:lastRow="0" w:noHBand="0" w:noVBand="1" w:val="04A0"/>
+        <w:tblInd w:w="120" w:type="dxa"/>
+      </w:tblPr>
+      <w:tblGrid>
+        <w:gridCol w:w="2448"/>
+        <w:gridCol w:w="4464"/>
+        <w:gridCol w:w="2448"/>
+      </w:tblGrid>
+      <w:tr>
+        <w:trPr>
+          <w:tblHeader w:val="true"/>
+        </w:trPr>
+        <w:tc>
+          <w:tcPr>
+            <w:tcW w:type="dxa" w:w="2448"/>
+            <w:tcMar>
+              <w:top w:w="80" w:type="dxa"/>
+              <w:start w:w="120" w:type="dxa"/>
+              <w:bottom w:w="80" w:type="dxa"/>
+              <w:end w:w="120" w:type="dxa"/>
+            </w:tcMar>
+            <w:vAlign w:val="center"/>
+            <w:shd w:fill="E8EEF5"/>
+          </w:tcPr>
+          <w:p>
+            <w:pPr>
+              <w:spacing w:before="0" w:after="40" w:line="252" w:lineRule="auto"/>
+            </w:pPr>
+            <w:r>
+              <w:rPr>
+                <w:rFonts w:ascii="Calibri" w:hAnsi="Calibri"/>
+                <w:b/>
+                <w:color w:val="17365D"/>
+                <w:sz w:val="15"/>
+              </w:rPr>
+              <w:t>Metric</w:t>
+            </w:r>
+          </w:p>
+        </w:tc>
+        <w:tc>
+          <w:tcPr>
+            <w:tcW w:type="dxa" w:w="4464"/>
+            <w:tcMar>
+              <w:top w:w="80" w:type="dxa"/>
+              <w:start w:w="120" w:type="dxa"/>
+              <w:bottom w:w="80" w:type="dxa"/>
+              <w:end w:w="120" w:type="dxa"/>
+            </w:tcMar>
+            <w:vAlign w:val="center"/>
+            <w:shd w:fill="E8EEF5"/>
+          </w:tcPr>
+          <w:p>
+            <w:pPr>
+              <w:spacing w:before="0" w:after="40" w:line="252" w:lineRule="auto"/>
+            </w:pPr>
+            <w:r>
+              <w:rPr>
+                <w:rFonts w:ascii="Calibri" w:hAnsi="Calibri"/>
+                <w:b/>
+                <w:color w:val="17365D"/>
+                <w:sz w:val="15"/>
+              </w:rPr>
+              <w:t>Initial target</w:t>
+            </w:r>
+          </w:p>
+        </w:tc>
+        <w:tc>
+          <w:tcPr>
+            <w:tcW w:type="dxa" w:w="2448"/>
+            <w:tcMar>
+              <w:top w:w="80" w:type="dxa"/>
+              <w:start w:w="120" w:type="dxa"/>
+              <w:bottom w:w="80" w:type="dxa"/>
+              <w:end w:w="120" w:type="dxa"/>
+            </w:tcMar>
+            <w:vAlign w:val="center"/>
+            <w:shd w:fill="E8EEF5"/>
+          </w:tcPr>
+          <w:p>
+            <w:pPr>
+              <w:spacing w:before="0" w:after="40" w:line="252" w:lineRule="auto"/>
+            </w:pPr>
+            <w:r>
+              <w:rPr>
+                <w:rFonts w:ascii="Calibri" w:hAnsi="Calibri"/>
+                <w:b/>
+                <w:color w:val="17365D"/>
+                <w:sz w:val="15"/>
+              </w:rPr>
+              <w:t>Release rule</w:t>
+            </w:r>
+          </w:p>
+        </w:tc>
+      </w:tr>
+      <w:tr>
+        <w:tc>
+          <w:tcPr>
+            <w:tcW w:type="dxa" w:w="2448"/>
+            <w:tcMar>
+              <w:top w:w="80" w:type="dxa"/>
+              <w:start w:w="120" w:type="dxa"/>
+              <w:bottom w:w="80" w:type="dxa"/>
+              <w:end w:w="120" w:type="dxa"/>
+            </w:tcMar>
+            <w:vAlign w:val="center"/>
+          </w:tcPr>
+          <w:p>
+            <w:pPr>
+              <w:spacing w:before="0" w:after="40" w:line="252" w:lineRule="auto"/>
+            </w:pPr>
+            <w:r>
+              <w:rPr>
+                <w:rFonts w:ascii="Calibri" w:hAnsi="Calibri"/>
+                <w:b w:val="0"/>
+                <w:sz w:val="15"/>
+              </w:rPr>
+              <w:t>Warm authenticated restoration</w:t>
+            </w:r>
+          </w:p>
+        </w:tc>
+        <w:tc>
+          <w:tcPr>
+            <w:tcW w:type="dxa" w:w="4464"/>
+            <w:tcMar>
+              <w:top w:w="80" w:type="dxa"/>
+              <w:start w:w="120" w:type="dxa"/>
+              <w:bottom w:w="80" w:type="dxa"/>
+              <w:end w:w="120" w:type="dxa"/>
+            </w:tcMar>
+            <w:vAlign w:val="center"/>
+          </w:tcPr>
+          <w:p>
+            <w:pPr>
+              <w:spacing w:before="0" w:after="40" w:line="252" w:lineRule="auto"/>
+            </w:pPr>
+            <w:r>
+              <w:rPr>
+                <w:rFonts w:ascii="Calibri" w:hAnsi="Calibri"/>
+                <w:b w:val="0"/>
+                <w:sz w:val="15"/>
+              </w:rPr>
+              <w:t>p95 no slower than current production; aspirational &lt;= 1.5 seconds to usable cached shell</w:t>
+            </w:r>
+          </w:p>
+        </w:tc>
+        <w:tc>
+          <w:tcPr>
+            <w:tcW w:type="dxa" w:w="2448"/>
+            <w:tcMar>
+              <w:top w:w="80" w:type="dxa"/>
+              <w:start w:w="120" w:type="dxa"/>
+              <w:bottom w:w="80" w:type="dxa"/>
+              <w:end w:w="120" w:type="dxa"/>
+            </w:tcMar>
+            <w:vAlign w:val="center"/>
+          </w:tcPr>
+          <w:p>
+            <w:pPr>
+              <w:spacing w:before="0" w:after="40" w:line="252" w:lineRule="auto"/>
+            </w:pPr>
+            <w:r>
+              <w:rPr>
+                <w:rFonts w:ascii="Calibri" w:hAnsi="Calibri"/>
+                <w:b w:val="0"/>
+                <w:sz w:val="15"/>
+              </w:rPr>
+              <w:t>Block rollout if p95 regresses &gt;10% without approved reason.</w:t>
+            </w:r>
+          </w:p>
+        </w:tc>
+      </w:tr>
+      <w:tr>
+        <w:tc>
+          <w:tcPr>
+            <w:tcW w:type="dxa" w:w="2448"/>
+            <w:tcMar>
+              <w:top w:w="80" w:type="dxa"/>
+              <w:start w:w="120" w:type="dxa"/>
+              <w:bottom w:w="80" w:type="dxa"/>
+              <w:end w:w="120" w:type="dxa"/>
+            </w:tcMar>
+            <w:vAlign w:val="center"/>
+          </w:tcPr>
+          <w:p>
+            <w:pPr>
+              <w:spacing w:before="0" w:after="40" w:line="252" w:lineRule="auto"/>
+            </w:pPr>
+            <w:r>
+              <w:rPr>
+                <w:rFonts w:ascii="Calibri" w:hAnsi="Calibri"/>
+                <w:b w:val="0"/>
+                <w:sz w:val="15"/>
+              </w:rPr>
+              <w:t>Cold credential login</w:t>
+            </w:r>
+          </w:p>
+        </w:tc>
+        <w:tc>
+          <w:tcPr>
+            <w:tcW w:type="dxa" w:w="4464"/>
+            <w:tcMar>
+              <w:top w:w="80" w:type="dxa"/>
+              <w:start w:w="120" w:type="dxa"/>
+              <w:bottom w:w="80" w:type="dxa"/>
+              <w:end w:w="120" w:type="dxa"/>
+            </w:tcMar>
+            <w:vAlign w:val="center"/>
+          </w:tcPr>
+          <w:p>
+            <w:pPr>
+              <w:spacing w:before="0" w:after="40" w:line="252" w:lineRule="auto"/>
+            </w:pPr>
+            <w:r>
+              <w:rPr>
+                <w:rFonts w:ascii="Calibri" w:hAnsi="Calibri"/>
+                <w:b w:val="0"/>
+                <w:sz w:val="15"/>
+              </w:rPr>
+              <w:t>p95 no slower than current production; aspirational &lt;= 3 seconds on normal school connection</w:t>
+            </w:r>
+          </w:p>
+        </w:tc>
+        <w:tc>
+          <w:tcPr>
+            <w:tcW w:type="dxa" w:w="2448"/>
+            <w:tcMar>
+              <w:top w:w="80" w:type="dxa"/>
+              <w:start w:w="120" w:type="dxa"/>
+              <w:bottom w:w="80" w:type="dxa"/>
+              <w:end w:w="120" w:type="dxa"/>
+            </w:tcMar>
+            <w:vAlign w:val="center"/>
+          </w:tcPr>
+          <w:p>
+            <w:pPr>
+              <w:spacing w:before="0" w:after="40" w:line="252" w:lineRule="auto"/>
+            </w:pPr>
+            <w:r>
+              <w:rPr>
+                <w:rFonts w:ascii="Calibri" w:hAnsi="Calibri"/>
+                <w:b w:val="0"/>
+                <w:sz w:val="15"/>
+              </w:rPr>
+              <w:t>Block if success rate drops or extra database scans appear.</w:t>
+            </w:r>
+          </w:p>
+        </w:tc>
+      </w:tr>
+      <w:tr>
+        <w:tc>
+          <w:tcPr>
+            <w:tcW w:type="dxa" w:w="2448"/>
+            <w:tcMar>
+              <w:top w:w="80" w:type="dxa"/>
+              <w:start w:w="120" w:type="dxa"/>
+              <w:bottom w:w="80" w:type="dxa"/>
+              <w:end w:w="120" w:type="dxa"/>
+            </w:tcMar>
+            <w:vAlign w:val="center"/>
+          </w:tcPr>
+          <w:p>
+            <w:pPr>
+              <w:spacing w:before="0" w:after="40" w:line="252" w:lineRule="auto"/>
+            </w:pPr>
+            <w:r>
+              <w:rPr>
+                <w:rFonts w:ascii="Calibri" w:hAnsi="Calibri"/>
+                <w:b w:val="0"/>
+                <w:sz w:val="15"/>
+              </w:rPr>
+              <w:t>Common cached route</w:t>
+            </w:r>
+          </w:p>
+        </w:tc>
+        <w:tc>
+          <w:tcPr>
+            <w:tcW w:type="dxa" w:w="4464"/>
+            <w:tcMar>
+              <w:top w:w="80" w:type="dxa"/>
+              <w:start w:w="120" w:type="dxa"/>
+              <w:bottom w:w="80" w:type="dxa"/>
+              <w:end w:w="120" w:type="dxa"/>
+            </w:tcMar>
+            <w:vAlign w:val="center"/>
+          </w:tcPr>
+          <w:p>
+            <w:pPr>
+              <w:spacing w:before="0" w:after="40" w:line="252" w:lineRule="auto"/>
+            </w:pPr>
+            <w:r>
+              <w:rPr>
+                <w:rFonts w:ascii="Calibri" w:hAnsi="Calibri"/>
+                <w:b w:val="0"/>
+                <w:sz w:val="15"/>
+              </w:rPr>
+              <w:t>Usable cached content &lt;= 1 second where current data exists</w:t>
+            </w:r>
+          </w:p>
+        </w:tc>
+        <w:tc>
+          <w:tcPr>
+            <w:tcW w:type="dxa" w:w="2448"/>
+            <w:tcMar>
+              <w:top w:w="80" w:type="dxa"/>
+              <w:start w:w="120" w:type="dxa"/>
+              <w:bottom w:w="80" w:type="dxa"/>
+              <w:end w:w="120" w:type="dxa"/>
+            </w:tcMar>
+            <w:vAlign w:val="center"/>
+          </w:tcPr>
+          <w:p>
+            <w:pPr>
+              <w:spacing w:before="0" w:after="40" w:line="252" w:lineRule="auto"/>
+            </w:pPr>
+            <w:r>
+              <w:rPr>
+                <w:rFonts w:ascii="Calibri" w:hAnsi="Calibri"/>
+                <w:b w:val="0"/>
+                <w:sz w:val="15"/>
+              </w:rPr>
+              <w:t>Security changes may not remove the immediate cached render.</w:t>
+            </w:r>
+          </w:p>
+        </w:tc>
+      </w:tr>
+      <w:tr>
+        <w:tc>
+          <w:tcPr>
+            <w:tcW w:type="dxa" w:w="2448"/>
+            <w:tcMar>
+              <w:top w:w="80" w:type="dxa"/>
+              <w:start w:w="120" w:type="dxa"/>
+              <w:bottom w:w="80" w:type="dxa"/>
+              <w:end w:w="120" w:type="dxa"/>
+            </w:tcMar>
+            <w:vAlign w:val="center"/>
+          </w:tcPr>
+          <w:p>
+            <w:pPr>
+              <w:spacing w:before="0" w:after="40" w:line="252" w:lineRule="auto"/>
+            </w:pPr>
+            <w:r>
+              <w:rPr>
+                <w:rFonts w:ascii="Calibri" w:hAnsi="Calibri"/>
+                <w:b w:val="0"/>
+                <w:sz w:val="15"/>
+              </w:rPr>
+              <w:t>Firestore reads/writes</w:t>
+            </w:r>
+          </w:p>
+        </w:tc>
+        <w:tc>
+          <w:tcPr>
+            <w:tcW w:type="dxa" w:w="4464"/>
+            <w:tcMar>
+              <w:top w:w="80" w:type="dxa"/>
+              <w:start w:w="120" w:type="dxa"/>
+              <w:bottom w:w="80" w:type="dxa"/>
+              <w:end w:w="120" w:type="dxa"/>
+            </w:tcMar>
+            <w:vAlign w:val="center"/>
+          </w:tcPr>
+          <w:p>
+            <w:pPr>
+              <w:spacing w:before="0" w:after="40" w:line="252" w:lineRule="auto"/>
+            </w:pPr>
+            <w:r>
+              <w:rPr>
+                <w:rFonts w:ascii="Calibri" w:hAnsi="Calibri"/>
+                <w:b w:val="0"/>
+                <w:sz w:val="15"/>
+              </w:rPr>
+              <w:t>No increase per active user/session; target reduction through summaries and scoped invalidation</w:t>
+            </w:r>
+          </w:p>
+        </w:tc>
+        <w:tc>
+          <w:tcPr>
+            <w:tcW w:type="dxa" w:w="2448"/>
+            <w:tcMar>
+              <w:top w:w="80" w:type="dxa"/>
+              <w:start w:w="120" w:type="dxa"/>
+              <w:bottom w:w="80" w:type="dxa"/>
+              <w:end w:w="120" w:type="dxa"/>
+            </w:tcMar>
+            <w:vAlign w:val="center"/>
+          </w:tcPr>
+          <w:p>
+            <w:pPr>
+              <w:spacing w:before="0" w:after="40" w:line="252" w:lineRule="auto"/>
+            </w:pPr>
+            <w:r>
+              <w:rPr>
+                <w:rFonts w:ascii="Calibri" w:hAnsi="Calibri"/>
+                <w:b w:val="0"/>
+                <w:sz w:val="15"/>
+              </w:rPr>
+              <w:t>Compare by role and route before cohort expansion.</w:t>
+            </w:r>
+          </w:p>
+        </w:tc>
+      </w:tr>
+      <w:tr>
+        <w:tc>
+          <w:tcPr>
+            <w:tcW w:type="dxa" w:w="2448"/>
+            <w:tcMar>
+              <w:top w:w="80" w:type="dxa"/>
+              <w:start w:w="120" w:type="dxa"/>
+              <w:bottom w:w="80" w:type="dxa"/>
+              <w:end w:w="120" w:type="dxa"/>
+            </w:tcMar>
+            <w:vAlign w:val="center"/>
+          </w:tcPr>
+          <w:p>
+            <w:pPr>
+              <w:spacing w:before="0" w:after="40" w:line="252" w:lineRule="auto"/>
+            </w:pPr>
+            <w:r>
+              <w:rPr>
+                <w:rFonts w:ascii="Calibri" w:hAnsi="Calibri"/>
+                <w:b w:val="0"/>
+                <w:sz w:val="15"/>
+              </w:rPr>
+              <w:t>Cache correctness</w:t>
+            </w:r>
+          </w:p>
+        </w:tc>
+        <w:tc>
+          <w:tcPr>
+            <w:tcW w:type="dxa" w:w="4464"/>
+            <w:tcMar>
+              <w:top w:w="80" w:type="dxa"/>
+              <w:start w:w="120" w:type="dxa"/>
+              <w:bottom w:w="80" w:type="dxa"/>
+              <w:end w:w="120" w:type="dxa"/>
+            </w:tcMar>
+            <w:vAlign w:val="center"/>
+          </w:tcPr>
+          <w:p>
+            <w:pPr>
+              <w:spacing w:before="0" w:after="40" w:line="252" w:lineRule="auto"/>
+            </w:pPr>
+            <w:r>
+              <w:rPr>
+                <w:rFonts w:ascii="Calibri" w:hAnsi="Calibri"/>
+                <w:b w:val="0"/>
+                <w:sz w:val="15"/>
+              </w:rPr>
+              <w:t>No cross-account exposure; stale sensitive actions rejected/revalidated</w:t>
+            </w:r>
+          </w:p>
+        </w:tc>
+        <w:tc>
+          <w:tcPr>
+            <w:tcW w:type="dxa" w:w="2448"/>
+            <w:tcMar>
+              <w:top w:w="80" w:type="dxa"/>
+              <w:start w:w="120" w:type="dxa"/>
+              <w:bottom w:w="80" w:type="dxa"/>
+              <w:end w:w="120" w:type="dxa"/>
+            </w:tcMar>
+            <w:vAlign w:val="center"/>
+          </w:tcPr>
+          <w:p>
+            <w:pPr>
+              <w:spacing w:before="0" w:after="40" w:line="252" w:lineRule="auto"/>
+            </w:pPr>
+            <w:r>
+              <w:rPr>
+                <w:rFonts w:ascii="Calibri" w:hAnsi="Calibri"/>
+                <w:b w:val="0"/>
+                <w:sz w:val="15"/>
+              </w:rPr>
+              <w:t>Any cross-user leak or stale authorization is an immediate rollback.</w:t>
+            </w:r>
+          </w:p>
+        </w:tc>
+      </w:tr>
+    </w:tbl>
+    <w:p>
+      <w:pPr>
+        <w:spacing w:after="0"/>
+      </w:pPr>
     </w:p>
     <w:p>
       <w:pPr>
@@ -9484,6 +11758,30 @@
       </w:pPr>
       <w:r>
         <w:t>PDF/report functionality still works after lazy loading.</w:t>
+      </w:r>
+    </w:p>
+    <w:p>
+      <w:pPr>
+        <w:spacing w:after="80"/>
+        <w:numPr>
+          <w:ilvl w:val="0"/>
+          <w:numId w:val="12"/>
+        </w:numPr>
+      </w:pPr>
+      <w:r>
+        <w:t>Warm restore, login and common-route p95 are no worse than the approved production baseline, and Firestore reads/writes per active user do not increase.</w:t>
+      </w:r>
+    </w:p>
+    <w:p>
+      <w:pPr>
+        <w:spacing w:after="80"/>
+        <w:numPr>
+          <w:ilvl w:val="0"/>
+          <w:numId w:val="12"/>
+        </w:numPr>
+      </w:pPr>
+      <w:r>
+        <w:t>Slow-network testing confirms cached screens remain usable, freshness is visible, and critical writes revalidate safely.</w:t>
       </w:r>
     </w:p>
     <w:p>
@@ -9993,14 +12291,15 @@
           </w:tcPr>
           <w:p>
             <w:pPr>
-              <w:spacing w:after="40" w:before="0" w:line="252" w:lineRule="auto"/>
-            </w:pPr>
-            <w:r>
-              <w:rPr>
-                <w:rFonts w:ascii="Calibri" w:hAnsi="Calibri"/>
+              <w:spacing w:before="0" w:after="40" w:line="252" w:lineRule="auto"/>
+            </w:pPr>
+            <w:r>
+              <w:rPr>
+                <w:rFonts w:ascii="Calibri" w:hAnsi="Calibri"/>
+                <w:b w:val="0"/>
                 <w:sz w:val="15"/>
               </w:rPr>
-              <w:t>Rotate/revoke secrets; remove source fallbacks; add secret scanning</w:t>
+              <w:t>Rotate/revoke secrets; add Firebase Secret Manager broker + Settings -&gt; Integrations; remove source fallbacks; add scanning</w:t>
             </w:r>
           </w:p>
         </w:tc>
@@ -10041,14 +12340,15 @@
           </w:tcPr>
           <w:p>
             <w:pPr>
-              <w:spacing w:after="40" w:before="0" w:line="252" w:lineRule="auto"/>
-            </w:pPr>
-            <w:r>
-              <w:rPr>
-                <w:rFonts w:ascii="Calibri" w:hAnsi="Calibri"/>
+              <w:spacing w:before="0" w:after="40" w:line="252" w:lineRule="auto"/>
+            </w:pPr>
+            <w:r>
+              <w:rPr>
+                <w:rFonts w:ascii="Calibri" w:hAnsi="Calibri"/>
+                <w:b w:val="0"/>
                 <w:sz w:val="15"/>
               </w:rPr>
-              <w:t>Provider smoke test; old credential rejected</w:t>
+              <w:t>Provider validation; in-app rotation; browser/Vercel never receives secret; old credential rejected</w:t>
             </w:r>
           </w:p>
         </w:tc>
@@ -10287,14 +12587,15 @@
           </w:tcPr>
           <w:p>
             <w:pPr>
-              <w:spacing w:after="40" w:before="0" w:line="252" w:lineRule="auto"/>
-            </w:pPr>
-            <w:r>
-              <w:rPr>
-                <w:rFonts w:ascii="Calibri" w:hAnsi="Calibri"/>
+              <w:spacing w:before="0" w:after="40" w:line="252" w:lineRule="auto"/>
+            </w:pPr>
+            <w:r>
+              <w:rPr>
+                <w:rFonts w:ascii="Calibri" w:hAnsi="Calibri"/>
+                <w:b w:val="0"/>
                 <w:sz w:val="15"/>
               </w:rPr>
-              <w:t>Firebase session/AuthContext compatibility bridge and cache-safe logout</w:t>
+              <w:t>Firebase session/AuthContext compatibility bridge, instant cached shell and partition-safe logout</w:t>
             </w:r>
           </w:p>
         </w:tc>
@@ -10335,14 +12636,15 @@
           </w:tcPr>
           <w:p>
             <w:pPr>
-              <w:spacing w:after="40" w:before="0" w:line="252" w:lineRule="auto"/>
-            </w:pPr>
-            <w:r>
-              <w:rPr>
-                <w:rFonts w:ascii="Calibri" w:hAnsi="Calibri"/>
+              <w:spacing w:before="0" w:after="40" w:line="252" w:lineRule="auto"/>
+            </w:pPr>
+            <w:r>
+              <w:rPr>
+                <w:rFonts w:ascii="Calibri" w:hAnsi="Calibri"/>
+                <w:b w:val="0"/>
                 <w:sz w:val="15"/>
               </w:rPr>
-              <w:t>Role workflow parity; storage tamper test</w:t>
+              <w:t>Role workflow parity; storage tamper test; warm/cold login and read-count non-regression</w:t>
             </w:r>
           </w:p>
         </w:tc>
@@ -11659,14 +13961,15 @@
           </w:tcPr>
           <w:p>
             <w:pPr>
-              <w:spacing w:after="40" w:before="0" w:line="252" w:lineRule="auto"/>
-            </w:pPr>
-            <w:r>
-              <w:rPr>
-                <w:rFonts w:ascii="Calibri" w:hAnsi="Calibri"/>
+              <w:spacing w:before="0" w:after="40" w:line="252" w:lineRule="auto"/>
+            </w:pPr>
+            <w:r>
+              <w:rPr>
+                <w:rFonts w:ascii="Calibri" w:hAnsi="Calibri"/>
+                <w:b w:val="0"/>
                 <w:sz w:val="15"/>
               </w:rPr>
-              <w:t>Performance, cleanup, deployment alignment and release rehearsal</w:t>
+              <w:t>Cache/read-model optimization, cleanup, deployment alignment and live rollback rehearsal</w:t>
             </w:r>
           </w:p>
         </w:tc>
@@ -11707,14 +14010,15 @@
           </w:tcPr>
           <w:p>
             <w:pPr>
-              <w:spacing w:after="40" w:before="0" w:line="252" w:lineRule="auto"/>
-            </w:pPr>
-            <w:r>
-              <w:rPr>
-                <w:rFonts w:ascii="Calibri" w:hAnsi="Calibri"/>
+              <w:spacing w:before="0" w:after="40" w:line="252" w:lineRule="auto"/>
+            </w:pPr>
+            <w:r>
+              <w:rPr>
+                <w:rFonts w:ascii="Calibri" w:hAnsi="Calibri"/>
+                <w:b w:val="0"/>
                 <w:sz w:val="15"/>
               </w:rPr>
-              <w:t>Production checklist and rollback drill</w:t>
+              <w:t>Security checklist plus speed/read-write budgets and rollback drill</w:t>
             </w:r>
           </w:p>
         </w:tc>
@@ -12116,7 +14420,7 @@
         <w:pStyle w:val="Heading1"/>
       </w:pPr>
       <w:r>
-        <w:t>Production release checklist</w:t>
+        <w:t>Live-production release and continued-operation checklist</w:t>
       </w:r>
     </w:p>
     <w:p>
@@ -12302,6 +14606,30 @@
       </w:pPr>
       <w:r>
         <w:t>A staging release rehearsal and production rollback rehearsal have succeeded within the recovery objective.</w:t>
+      </w:r>
+    </w:p>
+    <w:p>
+      <w:pPr>
+        <w:spacing w:after="80"/>
+        <w:numPr>
+          <w:ilvl w:val="0"/>
+          <w:numId w:val="12"/>
+        </w:numPr>
+      </w:pPr>
+      <w:r>
+        <w:t>The in-app integration settings screen stores private credentials only through the protected Firebase secret broker; no private value is bundled, cached, logged, returned to the browser or required in Vercel environment variables.</w:t>
+      </w:r>
+    </w:p>
+    <w:p>
+      <w:pPr>
+        <w:spacing w:after="80"/>
+        <w:numPr>
+          <w:ilvl w:val="0"/>
+          <w:numId w:val="12"/>
+        </w:numPr>
+      </w:pPr>
+      <w:r>
+        <w:t>Warm session restoration, common cached routes and Firestore reads/writes meet the approved production non-regression budgets on representative school devices and slow connections.</w:t>
       </w:r>
     </w:p>
     <w:p>
@@ -12321,9 +14649,9 @@
       <w:tblPr>
         <w:tblStyle w:val="TableGrid"/>
         <w:tblW w:type="dxa" w:w="9360"/>
-        <w:jc w:val="center"/>
         <w:tblLayout w:type="fixed"/>
         <w:tblLook w:firstColumn="1" w:firstRow="1" w:lastColumn="0" w:lastRow="0" w:noHBand="0" w:noVBand="1" w:val="04A0"/>
+        <w:jc w:val="center"/>
         <w:tblInd w:w="120" w:type="dxa"/>
       </w:tblPr>
       <w:tblGrid>
@@ -12803,14 +15131,15 @@
           </w:tcPr>
           <w:p>
             <w:pPr>
-              <w:spacing w:after="40" w:before="0" w:line="252" w:lineRule="auto"/>
-            </w:pPr>
-            <w:r>
-              <w:rPr>
-                <w:rFonts w:ascii="Calibri" w:hAnsi="Calibri"/>
+              <w:spacing w:before="0" w:after="40" w:line="252" w:lineRule="auto"/>
+            </w:pPr>
+            <w:r>
+              <w:rPr>
+                <w:rFonts w:ascii="Calibri" w:hAnsi="Calibri"/>
+                <w:b w:val="0"/>
                 <w:sz w:val="13"/>
               </w:rPr>
-              <w:t>localStorage user cache can be forged and persists without trustworthy session lifetime.</w:t>
+              <w:t>localStorage user state is treated as identity. Preserve instant cached display/session restoration, but require verified Firebase state before protected access.</w:t>
             </w:r>
           </w:p>
         </w:tc>
@@ -13437,14 +15766,15 @@
           </w:tcPr>
           <w:p>
             <w:pPr>
-              <w:spacing w:after="40" w:before="0" w:line="252" w:lineRule="auto"/>
-            </w:pPr>
-            <w:r>
-              <w:rPr>
-                <w:rFonts w:ascii="Calibri" w:hAnsi="Calibri"/>
+              <w:spacing w:before="0" w:after="40" w:line="252" w:lineRule="auto"/>
+            </w:pPr>
+            <w:r>
+              <w:rPr>
+                <w:rFonts w:ascii="Calibri" w:hAnsi="Calibri"/>
+                <w:b w:val="0"/>
                 <w:sz w:val="13"/>
               </w:rPr>
-              <w:t>Phases 1, 5</w:t>
+              <w:t>Phases 1, 5: in-app secret broker + Secret Manager + guarded provider functions</w:t>
             </w:r>
           </w:p>
         </w:tc>
@@ -15731,14 +18061,15 @@
           </w:tcPr>
           <w:p>
             <w:pPr>
-              <w:spacing w:after="40" w:before="0" w:line="252" w:lineRule="auto"/>
-            </w:pPr>
-            <w:r>
-              <w:rPr>
-                <w:rFonts w:ascii="Calibri" w:hAnsi="Calibri"/>
+              <w:spacing w:before="0" w:after="40" w:line="252" w:lineRule="auto"/>
+            </w:pPr>
+            <w:r>
+              <w:rPr>
+                <w:rFonts w:ascii="Calibri" w:hAnsi="Calibri"/>
+                <w:b w:val="0"/>
                 <w:sz w:val="13"/>
               </w:rPr>
-              <w:t>Admin/Staff globally preload broad sensitive datasets.</w:t>
+              <w:t>Broad preload solved latency/read pressure but should become permission- and route-aware without removing cached-first behavior.</w:t>
             </w:r>
           </w:p>
         </w:tc>
@@ -15975,14 +18306,15 @@
           </w:tcPr>
           <w:p>
             <w:pPr>
-              <w:spacing w:after="40" w:before="0" w:line="252" w:lineRule="auto"/>
-            </w:pPr>
-            <w:r>
-              <w:rPr>
-                <w:rFonts w:ascii="Calibri" w:hAnsi="Calibri"/>
+              <w:spacing w:before="0" w:after="40" w:line="252" w:lineRule="auto"/>
+            </w:pPr>
+            <w:r>
+              <w:rPr>
+                <w:rFonts w:ascii="Calibri" w:hAnsi="Calibri"/>
+                <w:b w:val="0"/>
                 <w:sz w:val="13"/>
               </w:rPr>
-              <w:t>Sensitive school data can remain on shared or compromised devices.</w:t>
+              <w:t>Persistent data improves slow-network performance; risk is cross-user/sensitive retention. Partition by UID/school/version and clear protected data on logout.</w:t>
             </w:r>
           </w:p>
         </w:tc>
@@ -16739,6 +19071,260 @@
                 <w:sz w:val="13"/>
               </w:rPr>
               <w:t>Phases 9–10</w:t>
+            </w:r>
+          </w:p>
+        </w:tc>
+      </w:tr>
+      <w:tr>
+        <w:tc>
+          <w:tcPr>
+            <w:tcW w:type="dxa" w:w="1080"/>
+            <w:tcMar>
+              <w:top w:w="80" w:type="dxa"/>
+              <w:start w:w="120" w:type="dxa"/>
+              <w:bottom w:w="80" w:type="dxa"/>
+              <w:end w:w="120" w:type="dxa"/>
+            </w:tcMar>
+            <w:vAlign w:val="center"/>
+          </w:tcPr>
+          <w:p>
+            <w:pPr>
+              <w:spacing w:before="0" w:after="40" w:line="252" w:lineRule="auto"/>
+            </w:pPr>
+            <w:r>
+              <w:rPr>
+                <w:rFonts w:ascii="Calibri" w:hAnsi="Calibri"/>
+                <w:b w:val="0"/>
+                <w:sz w:val="13"/>
+              </w:rPr>
+              <w:t>CFG-01 P0</w:t>
+            </w:r>
+          </w:p>
+        </w:tc>
+        <w:tc>
+          <w:tcPr>
+            <w:tcW w:type="dxa" w:w="2376"/>
+            <w:tcMar>
+              <w:top w:w="80" w:type="dxa"/>
+              <w:start w:w="120" w:type="dxa"/>
+              <w:bottom w:w="80" w:type="dxa"/>
+              <w:end w:w="120" w:type="dxa"/>
+            </w:tcMar>
+            <w:vAlign w:val="center"/>
+          </w:tcPr>
+          <w:p>
+            <w:pPr>
+              <w:spacing w:before="0" w:after="40" w:line="252" w:lineRule="auto"/>
+            </w:pPr>
+            <w:r>
+              <w:rPr>
+                <w:rFonts w:ascii="Calibri" w:hAnsi="Calibri"/>
+                <w:b w:val="0"/>
+                <w:sz w:val="13"/>
+              </w:rPr>
+              <w:t>functions/index.js provider credential fallbacks</w:t>
+            </w:r>
+          </w:p>
+        </w:tc>
+        <w:tc>
+          <w:tcPr>
+            <w:tcW w:type="dxa" w:w="1800"/>
+            <w:tcMar>
+              <w:top w:w="80" w:type="dxa"/>
+              <w:start w:w="120" w:type="dxa"/>
+              <w:bottom w:w="80" w:type="dxa"/>
+              <w:end w:w="120" w:type="dxa"/>
+            </w:tcMar>
+            <w:vAlign w:val="center"/>
+          </w:tcPr>
+          <w:p>
+            <w:pPr>
+              <w:spacing w:before="0" w:after="40" w:line="252" w:lineRule="auto"/>
+            </w:pPr>
+            <w:r>
+              <w:rPr>
+                <w:rFonts w:ascii="Calibri" w:hAnsi="Calibri"/>
+                <w:b w:val="0"/>
+                <w:sz w:val="13"/>
+              </w:rPr>
+              <w:t>Integration settings</w:t>
+            </w:r>
+          </w:p>
+        </w:tc>
+        <w:tc>
+          <w:tcPr>
+            <w:tcW w:type="dxa" w:w="3240"/>
+            <w:tcMar>
+              <w:top w:w="80" w:type="dxa"/>
+              <w:start w:w="120" w:type="dxa"/>
+              <w:bottom w:w="80" w:type="dxa"/>
+              <w:end w:w="120" w:type="dxa"/>
+            </w:tcMar>
+            <w:vAlign w:val="center"/>
+          </w:tcPr>
+          <w:p>
+            <w:pPr>
+              <w:spacing w:before="0" w:after="40" w:line="252" w:lineRule="auto"/>
+            </w:pPr>
+            <w:r>
+              <w:rPr>
+                <w:rFonts w:ascii="Calibri" w:hAnsi="Calibri"/>
+                <w:b w:val="0"/>
+                <w:sz w:val="13"/>
+              </w:rPr>
+              <w:t>Owner requires frontend entry without Vercel env editing; a private key still cannot be stored in frontend code or readable Firestore.</w:t>
+            </w:r>
+          </w:p>
+        </w:tc>
+        <w:tc>
+          <w:tcPr>
+            <w:tcW w:type="dxa" w:w="864"/>
+            <w:tcMar>
+              <w:top w:w="80" w:type="dxa"/>
+              <w:start w:w="120" w:type="dxa"/>
+              <w:bottom w:w="80" w:type="dxa"/>
+              <w:end w:w="120" w:type="dxa"/>
+            </w:tcMar>
+            <w:vAlign w:val="center"/>
+          </w:tcPr>
+          <w:p>
+            <w:pPr>
+              <w:spacing w:before="0" w:after="40" w:line="252" w:lineRule="auto"/>
+            </w:pPr>
+            <w:r>
+              <w:rPr>
+                <w:rFonts w:ascii="Calibri" w:hAnsi="Calibri"/>
+                <w:b w:val="0"/>
+                <w:sz w:val="13"/>
+              </w:rPr>
+              <w:t>Phases 1, 5</w:t>
+            </w:r>
+          </w:p>
+        </w:tc>
+      </w:tr>
+      <w:tr>
+        <w:tc>
+          <w:tcPr>
+            <w:tcW w:type="dxa" w:w="1080"/>
+            <w:tcMar>
+              <w:top w:w="80" w:type="dxa"/>
+              <w:start w:w="120" w:type="dxa"/>
+              <w:bottom w:w="80" w:type="dxa"/>
+              <w:end w:w="120" w:type="dxa"/>
+            </w:tcMar>
+            <w:vAlign w:val="center"/>
+          </w:tcPr>
+          <w:p>
+            <w:pPr>
+              <w:spacing w:before="0" w:after="40" w:line="252" w:lineRule="auto"/>
+            </w:pPr>
+            <w:r>
+              <w:rPr>
+                <w:rFonts w:ascii="Calibri" w:hAnsi="Calibri"/>
+                <w:b w:val="0"/>
+                <w:sz w:val="13"/>
+              </w:rPr>
+              <w:t>PERF-03 P1</w:t>
+            </w:r>
+          </w:p>
+        </w:tc>
+        <w:tc>
+          <w:tcPr>
+            <w:tcW w:type="dxa" w:w="2376"/>
+            <w:tcMar>
+              <w:top w:w="80" w:type="dxa"/>
+              <w:start w:w="120" w:type="dxa"/>
+              <w:bottom w:w="80" w:type="dxa"/>
+              <w:end w:w="120" w:type="dxa"/>
+            </w:tcMar>
+            <w:vAlign w:val="center"/>
+          </w:tcPr>
+          <w:p>
+            <w:pPr>
+              <w:spacing w:before="0" w:after="40" w:line="252" w:lineRule="auto"/>
+            </w:pPr>
+            <w:r>
+              <w:rPr>
+                <w:rFonts w:ascii="Calibri" w:hAnsi="Calibri"/>
+                <w:b w:val="0"/>
+                <w:sz w:val="13"/>
+              </w:rPr>
+              <w:t>AuthContext, Firestore persistence, GlobalDataPreloader</w:t>
+            </w:r>
+          </w:p>
+        </w:tc>
+        <w:tc>
+          <w:tcPr>
+            <w:tcW w:type="dxa" w:w="1800"/>
+            <w:tcMar>
+              <w:top w:w="80" w:type="dxa"/>
+              <w:start w:w="120" w:type="dxa"/>
+              <w:bottom w:w="80" w:type="dxa"/>
+              <w:end w:w="120" w:type="dxa"/>
+            </w:tcMar>
+            <w:vAlign w:val="center"/>
+          </w:tcPr>
+          <w:p>
+            <w:pPr>
+              <w:spacing w:before="0" w:after="40" w:line="252" w:lineRule="auto"/>
+            </w:pPr>
+            <w:r>
+              <w:rPr>
+                <w:rFonts w:ascii="Calibri" w:hAnsi="Calibri"/>
+                <w:b w:val="0"/>
+                <w:sz w:val="13"/>
+              </w:rPr>
+              <w:t>Warm login and cached screens</w:t>
+            </w:r>
+          </w:p>
+        </w:tc>
+        <w:tc>
+          <w:tcPr>
+            <w:tcW w:type="dxa" w:w="3240"/>
+            <w:tcMar>
+              <w:top w:w="80" w:type="dxa"/>
+              <w:start w:w="120" w:type="dxa"/>
+              <w:bottom w:w="80" w:type="dxa"/>
+              <w:end w:w="120" w:type="dxa"/>
+            </w:tcMar>
+            <w:vAlign w:val="center"/>
+          </w:tcPr>
+          <w:p>
+            <w:pPr>
+              <w:spacing w:before="0" w:after="40" w:line="252" w:lineRule="auto"/>
+            </w:pPr>
+            <w:r>
+              <w:rPr>
+                <w:rFonts w:ascii="Calibri" w:hAnsi="Calibri"/>
+                <w:b w:val="0"/>
+                <w:sz w:val="13"/>
+              </w:rPr>
+              <w:t>Performance/read-cost benefits are production requirements; remediation must meet speed and read/write non-regression gates.</w:t>
+            </w:r>
+          </w:p>
+        </w:tc>
+        <w:tc>
+          <w:tcPr>
+            <w:tcW w:type="dxa" w:w="864"/>
+            <w:tcMar>
+              <w:top w:w="80" w:type="dxa"/>
+              <w:start w:w="120" w:type="dxa"/>
+              <w:bottom w:w="80" w:type="dxa"/>
+              <w:end w:w="120" w:type="dxa"/>
+            </w:tcMar>
+            <w:vAlign w:val="center"/>
+          </w:tcPr>
+          <w:p>
+            <w:pPr>
+              <w:spacing w:before="0" w:after="40" w:line="252" w:lineRule="auto"/>
+            </w:pPr>
+            <w:r>
+              <w:rPr>
+                <w:rFonts w:ascii="Calibri" w:hAnsi="Calibri"/>
+                <w:b w:val="0"/>
+                <w:sz w:val="13"/>
+              </w:rPr>
+              <w:t>Phases 0, 2, 9</w:t>
             </w:r>
           </w:p>
         </w:tc>
@@ -16754,7 +19340,7 @@
         <w:pStyle w:val="Heading1"/>
       </w:pPr>
       <w:r>
-        <w:t>First 72 hours: operational checklist</w:t>
+        <w:t>Live-production first 72 hours: operational checklist</w:t>
       </w:r>
     </w:p>
     <w:p>
@@ -16766,7 +19352,7 @@
         <w:spacing w:after="80"/>
       </w:pPr>
       <w:r>
-        <w:t>Name the incident/remediation owner and freeze unrelated production deployments.</w:t>
+        <w:t>Name the remediation/incident owner and place production under controlled change: normal school use continues, while unrelated high-risk deployments require explicit review.</w:t>
       </w:r>
     </w:p>
     <w:p>
@@ -16778,7 +19364,7 @@
         <w:spacing w:after="80"/>
       </w:pPr>
       <w:r>
-        <w:t>Confirm the exact currently deployed commits and capture backups.</w:t>
+        <w:t>Confirm the exact deployed commits, capture backups and verify production monitoring/alert contacts.</w:t>
       </w:r>
     </w:p>
     <w:p>
@@ -16790,7 +19376,7 @@
         <w:spacing w:after="80"/>
       </w:pPr>
       <w:r>
-        <w:t>Rotate and revoke all provider secrets found in source/config/history.</w:t>
+        <w:t>Measure warm login, cold login, common cached routes, Firestore reads/writes, active listeners and current error rates before changing cache/authentication.</w:t>
       </w:r>
     </w:p>
     <w:p>
@@ -16802,7 +19388,7 @@
         <w:spacing w:after="80"/>
       </w:pPr>
       <w:r>
-        <w:t>Disable the public admin setup path and confirm a known admin can still sign in.</w:t>
+        <w:t>Rotate/revoke exposed provider secrets and begin the Firebase Secret Manager broker plus Settings -&gt; Integrations workflow.</w:t>
       </w:r>
     </w:p>
     <w:p>
@@ -16814,7 +19400,7 @@
         <w:spacing w:after="80"/>
       </w:pPr>
       <w:r>
-        <w:t>Place emergency guards and low quotas on SMS/recharge/upload/delete/mutating routes.</w:t>
+        <w:t>Disable the public admin setup path and confirm a known administrator can still sign in quickly through the live path.</w:t>
       </w:r>
     </w:p>
     <w:p>
@@ -16826,7 +19412,7 @@
         <w:spacing w:after="80"/>
       </w:pPr>
       <w:r>
-        <w:t>Create isolated staging with non-production provider accounts and data.</w:t>
+        <w:t>Apply emergency verified-caller guards and low quotas on SMS/recharge/upload/delete/mutating routes using canaries and latency/error monitoring.</w:t>
       </w:r>
     </w:p>
     <w:p>
@@ -16838,7 +19424,7 @@
         <w:spacing w:after="80"/>
       </w:pPr>
       <w:r>
-        <w:t>Begin the server-backed authentication bridge; do not deploy deny-by-default rules prematurely.</w:t>
+        <w:t>Create isolated staging with non-production provider accounts/data and run backup restore plus rollback rehearsals.</w:t>
       </w:r>
     </w:p>
     <w:p>
@@ -16850,7 +19436,7 @@
         <w:spacing w:after="80"/>
       </w:pPr>
       <w:r>
-        <w:t>Open tracking issues for every P0 item and link each to the relevant gate in this runbook.</w:t>
+        <w:t>Begin the fast Firebase session bridge; do not remove cached-first rendering or deploy restrictive rules until all active roles can obtain verified identity.</w:t>
       </w:r>
     </w:p>
     <w:p>
@@ -16999,14 +19585,15 @@
           </w:tcPr>
           <w:p>
             <w:pPr>
-              <w:spacing w:after="40" w:before="0" w:line="252" w:lineRule="auto"/>
-            </w:pPr>
-            <w:r>
-              <w:rPr>
-                <w:rFonts w:ascii="Calibri" w:hAnsi="Calibri"/>
-                <w:sz w:val="17"/>
-              </w:rPr>
-              <w:t>Safety net, backups, staging, secret rotation, admin setup removal, emergency guards.</w:t>
+              <w:spacing w:before="0" w:after="40" w:line="252" w:lineRule="auto"/>
+            </w:pPr>
+            <w:r>
+              <w:rPr>
+                <w:rFonts w:ascii="Calibri" w:hAnsi="Calibri"/>
+                <w:b w:val="0"/>
+                <w:sz w:val="16"/>
+              </w:rPr>
+              <w:t>Live safety net, performance/read baseline, secret rotation, in-app secret broker, admin setup removal and emergency guards.</w:t>
             </w:r>
           </w:p>
         </w:tc>
@@ -17023,14 +19610,15 @@
           </w:tcPr>
           <w:p>
             <w:pPr>
-              <w:spacing w:after="40" w:before="0" w:line="252" w:lineRule="auto"/>
-            </w:pPr>
-            <w:r>
-              <w:rPr>
-                <w:rFonts w:ascii="Calibri" w:hAnsi="Calibri"/>
-                <w:sz w:val="17"/>
-              </w:rPr>
-              <w:t>No normal production release until P0 containment is verified.</w:t>
+              <w:spacing w:before="0" w:after="40" w:line="252" w:lineRule="auto"/>
+            </w:pPr>
+            <w:r>
+              <w:rPr>
+                <w:rFonts w:ascii="Calibri" w:hAnsi="Calibri"/>
+                <w:b w:val="0"/>
+                <w:sz w:val="16"/>
+              </w:rPr>
+              <w:t>Service remains live; only reviewed containment changes expand after canary checks.</w:t>
             </w:r>
           </w:p>
         </w:tc>
@@ -17073,14 +19661,15 @@
           </w:tcPr>
           <w:p>
             <w:pPr>
-              <w:spacing w:after="40" w:before="0" w:line="252" w:lineRule="auto"/>
-            </w:pPr>
-            <w:r>
-              <w:rPr>
-                <w:rFonts w:ascii="Calibri" w:hAnsi="Calibri"/>
-                <w:sz w:val="17"/>
-              </w:rPr>
-              <w:t>Secure authentication bridge and initial canonical user model.</w:t>
+              <w:spacing w:before="0" w:after="40" w:line="252" w:lineRule="auto"/>
+            </w:pPr>
+            <w:r>
+              <w:rPr>
+                <w:rFonts w:ascii="Calibri" w:hAnsi="Calibri"/>
+                <w:b w:val="0"/>
+                <w:sz w:val="16"/>
+              </w:rPr>
+              <w:t>Fast secure session bridge, cached-shell compatibility and initial canonical user model.</w:t>
             </w:r>
           </w:p>
         </w:tc>
@@ -17097,14 +19686,15 @@
           </w:tcPr>
           <w:p>
             <w:pPr>
-              <w:spacing w:after="40" w:before="0" w:line="252" w:lineRule="auto"/>
-            </w:pPr>
-            <w:r>
-              <w:rPr>
-                <w:rFonts w:ascii="Calibri" w:hAnsi="Calibri"/>
-                <w:sz w:val="17"/>
-              </w:rPr>
-              <w:t>Internal cohort only; compatibility adapter remains.</w:t>
+              <w:spacing w:before="0" w:after="40" w:line="252" w:lineRule="auto"/>
+            </w:pPr>
+            <w:r>
+              <w:rPr>
+                <w:rFonts w:ascii="Calibri" w:hAnsi="Calibri"/>
+                <w:b w:val="0"/>
+                <w:sz w:val="16"/>
+              </w:rPr>
+              <w:t>Internal cohort; warm/cold login and Firestore-read non-regression required.</w:t>
             </w:r>
           </w:p>
         </w:tc>
@@ -17369,14 +19959,15 @@
           </w:tcPr>
           <w:p>
             <w:pPr>
-              <w:spacing w:after="40" w:before="0" w:line="252" w:lineRule="auto"/>
-            </w:pPr>
-            <w:r>
-              <w:rPr>
-                <w:rFonts w:ascii="Calibri" w:hAnsi="Calibri"/>
-                <w:sz w:val="17"/>
-              </w:rPr>
-              <w:t>Type/lint burn-down, dependency upgrades, performance, cleanup, deployment rehearsal.</w:t>
+              <w:spacing w:before="0" w:after="40" w:line="252" w:lineRule="auto"/>
+            </w:pPr>
+            <w:r>
+              <w:rPr>
+                <w:rFonts w:ascii="Calibri" w:hAnsi="Calibri"/>
+                <w:b w:val="0"/>
+                <w:sz w:val="16"/>
+              </w:rPr>
+              <w:t>Cache/read-model optimization, type/lint burn-down, dependency upgrades, cleanup and deployment rehearsal.</w:t>
             </w:r>
           </w:p>
         </w:tc>
@@ -17393,14 +19984,15 @@
           </w:tcPr>
           <w:p>
             <w:pPr>
-              <w:spacing w:after="40" w:before="0" w:line="252" w:lineRule="auto"/>
-            </w:pPr>
-            <w:r>
-              <w:rPr>
-                <w:rFonts w:ascii="Calibri" w:hAnsi="Calibri"/>
-                <w:sz w:val="17"/>
-              </w:rPr>
-              <w:t>Final approval only after the complete production checklist.</w:t>
+              <w:spacing w:before="0" w:after="40" w:line="252" w:lineRule="auto"/>
+            </w:pPr>
+            <w:r>
+              <w:rPr>
+                <w:rFonts w:ascii="Calibri" w:hAnsi="Calibri"/>
+                <w:b w:val="0"/>
+                <w:sz w:val="16"/>
+              </w:rPr>
+              <w:t>Final approval requires security gates plus speed/read-write budgets.</w:t>
             </w:r>
           </w:p>
         </w:tc>

</xml_diff>